<commit_message>
docs: re-render user manual after engine-default text change
The default-engine wording change in USER-MANUAL.md left the rendered
PDF/DOCX and render manifest stale; ci-docs' --check-current gate hashes
source against the manifest and failed. Regenerated with the repo's own
render_user_manual.py; verified PASS with the exact CI check locally.

Co-Authored-By: Claude Fable 5 <noreply@anthropic.com>
Signed-off-by: Scott Converse <scottconverse@users.noreply.github.com>
</commit_message>
<xml_diff>
--- a/docs/USER-MANUAL.docx
+++ b/docs/USER-MANUAL.docx
@@ -4036,28 +4036,28 @@
         <w:rPr>
           <w:rStyle w:val="VerbatimChar"/>
         </w:rPr>
+        <w:t xml:space="preserve">gstreamer</w:t>
+      </w:r>
+      <w:r>
+        <w:t xml:space="preserve"> </w:t>
+      </w:r>
+      <w:r>
+        <w:t xml:space="preserve">(default, S15) or</w:t>
+      </w:r>
+      <w:r>
+        <w:t xml:space="preserve"> </w:t>
+      </w:r>
+      <w:r>
+        <w:rPr>
+          <w:rStyle w:val="VerbatimChar"/>
+        </w:rPr>
         <w:t xml:space="preserve">ffmpeg-concat</w:t>
       </w:r>
       <w:r>
         <w:t xml:space="preserve"> </w:t>
       </w:r>
       <w:r>
-        <w:t xml:space="preserve">(default) or</w:t>
-      </w:r>
-      <w:r>
-        <w:t xml:space="preserve"> </w:t>
-      </w:r>
-      <w:r>
-        <w:rPr>
-          <w:rStyle w:val="VerbatimChar"/>
-        </w:rPr>
-        <w:t xml:space="preserve">gstreamer</w:t>
-      </w:r>
-      <w:r>
-        <w:t xml:space="preserve"> </w:t>
-      </w:r>
-      <w:r>
-        <w:t xml:space="preserve">(S15).</w:t>
+        <w:t xml:space="preserve">(legacy fallback).</w:t>
       </w:r>
     </w:p>
     <w:p>
@@ -11740,52 +11740,46 @@
         <w:rPr>
           <w:rStyle w:val="VerbatimChar"/>
         </w:rPr>
-        <w:t xml:space="preserve">CIVICCAST_EGRESS_ENGINE=gstreamer</w:t>
-      </w:r>
-      <w:r>
-        <w:t xml:space="preserve"> </w:t>
-      </w:r>
-      <w:r>
-        <w:t xml:space="preserve">switches the daemon to the new</w:t>
-      </w:r>
-      <w:r>
-        <w:t xml:space="preserve"> </w:t>
-      </w:r>
-      <w:r>
-        <w:t xml:space="preserve">engine; the default is still</w:t>
-      </w:r>
-      <w:r>
-        <w:t xml:space="preserve"> </w:t>
-      </w:r>
-      <w:r>
-        <w:rPr>
-          <w:rStyle w:val="VerbatimChar"/>
-        </w:rPr>
-        <w:t xml:space="preserve">ffmpeg-concat</w:t>
-      </w:r>
-      <w:r>
-        <w:t xml:space="preserve"> </w:t>
-      </w:r>
-      <w:r>
-        <w:t xml:space="preserve">for backwards</w:t>
-      </w:r>
-      <w:r>
-        <w:t xml:space="preserve"> </w:t>
-      </w:r>
-      <w:r>
-        <w:t xml:space="preserve">compatibility. Per-station, the v3.0 station-in-a-box specification recommends</w:t>
-      </w:r>
-      <w:r>
-        <w:t xml:space="preserve"> </w:t>
-      </w:r>
-      <w:r>
-        <w:rPr>
-          <w:rStyle w:val="VerbatimChar"/>
-        </w:rPr>
         <w:t xml:space="preserve">gstreamer</w:t>
       </w:r>
       <w:r>
-        <w:t xml:space="preserve">.</w:t>
+        <w:t xml:space="preserve"> </w:t>
+      </w:r>
+      <w:r>
+        <w:t xml:space="preserve">is the default engine, matching the v3.0 station-in-a-box</w:t>
+      </w:r>
+      <w:r>
+        <w:t xml:space="preserve"> </w:t>
+      </w:r>
+      <w:r>
+        <w:t xml:space="preserve">specification’s recommendation and the native station bootstrap’s own</w:t>
+      </w:r>
+      <w:r>
+        <w:t xml:space="preserve"> </w:t>
+      </w:r>
+      <w:r>
+        <w:t xml:space="preserve">runtime contract. Set</w:t>
+      </w:r>
+      <w:r>
+        <w:t xml:space="preserve"> </w:t>
+      </w:r>
+      <w:r>
+        <w:rPr>
+          <w:rStyle w:val="VerbatimChar"/>
+        </w:rPr>
+        <w:t xml:space="preserve">CIVICCAST_EGRESS_ENGINE=ffmpeg-concat</w:t>
+      </w:r>
+      <w:r>
+        <w:t xml:space="preserve"> </w:t>
+      </w:r>
+      <w:r>
+        <w:t xml:space="preserve">to opt back</w:t>
+      </w:r>
+      <w:r>
+        <w:t xml:space="preserve"> </w:t>
+      </w:r>
+      <w:r>
+        <w:t xml:space="preserve">into the legacy ffmpeg-relay model for backwards compatibility.</w:t>
       </w:r>
     </w:p>
     <w:bookmarkEnd w:id="64"/>

</xml_diff>

<commit_message>
docs: re-render USER-MANUAL.pdf/docx after the USER-MANUAL.md coturn edit
The item-4 commit edited docs/USER-MANUAL.md's CIVICCAST_TURN_HOST/
CIVICCAST_TURN_PORT/CIVICCAST_COTURN_COMMAND reference (expanded from a
one-line stub to full guidance) but didn't re-render the tracked PDF/DOCX
artifacts the ci-docs Pandoc job checks for currency against the
source's sha256. Re-rendered via
`uv run python scripts/render_user_manual.py --out-dir docs`
(xelatex from the MiKTeX install); `--check-current` now PASSes.
docs/USER-MANUAL.render.json's manifest hash was already updated and
committed in the migration-head-pin commit (afaa17e) as a side effect of
staging it during verification; no separate change needed there.

Signed-off-by: Scott Converse <scottconverse@users.noreply.github.com>

Co-Authored-By: Claude Fable 5 <noreply@anthropic.com>
</commit_message>
<xml_diff>
--- a/docs/USER-MANUAL.docx
+++ b/docs/USER-MANUAL.docx
@@ -7878,10 +7878,178 @@
         <w:t xml:space="preserve">CIVICCAST_TURN_HOST</w:t>
       </w:r>
       <w:r>
-        <w:br/>
-      </w:r>
-      <w:r>
-        <w:t xml:space="preserve">TURN/VDO co-process commands.</w:t>
+        <w:t xml:space="preserve"> </w:t>
+      </w:r>
+      <w:r>
+        <w:t xml:space="preserve">/</w:t>
+      </w:r>
+      <w:r>
+        <w:t xml:space="preserve"> </w:t>
+      </w:r>
+      <w:r>
+        <w:rPr>
+          <w:rStyle w:val="VerbatimChar"/>
+          <w:b/>
+          <w:bCs/>
+        </w:rPr>
+        <w:t xml:space="preserve">CIVICCAST_TURN_PORT</w:t>
+      </w:r>
+      <w:r>
+        <w:br/>
+      </w:r>
+      <w:r>
+        <w:t xml:space="preserve">The TURN server guests connect through to punch out from behind NAT. coturn</w:t>
+      </w:r>
+      <w:r>
+        <w:t xml:space="preserve"> </w:t>
+      </w:r>
+      <w:r>
+        <w:t xml:space="preserve">has no native Windows build, so on Windows CivicCast does</w:t>
+      </w:r>
+      <w:r>
+        <w:t xml:space="preserve"> </w:t>
+      </w:r>
+      <w:r>
+        <w:rPr>
+          <w:b/>
+          <w:bCs/>
+        </w:rPr>
+        <w:t xml:space="preserve">not</w:t>
+      </w:r>
+      <w:r>
+        <w:t xml:space="preserve"> </w:t>
+      </w:r>
+      <w:r>
+        <w:t xml:space="preserve">run a</w:t>
+      </w:r>
+      <w:r>
+        <w:t xml:space="preserve"> </w:t>
+      </w:r>
+      <w:r>
+        <w:t xml:space="preserve">local coturn process: point these two variables at a</w:t>
+      </w:r>
+      <w:r>
+        <w:t xml:space="preserve"> </w:t>
+      </w:r>
+      <w:r>
+        <w:rPr>
+          <w:b/>
+          <w:bCs/>
+        </w:rPr>
+        <w:t xml:space="preserve">documented external</w:t>
+      </w:r>
+      <w:r>
+        <w:rPr>
+          <w:b/>
+          <w:bCs/>
+        </w:rPr>
+        <w:t xml:space="preserve"> </w:t>
+      </w:r>
+      <w:r>
+        <w:rPr>
+          <w:b/>
+          <w:bCs/>
+        </w:rPr>
+        <w:t xml:space="preserve">TURN server</w:t>
+      </w:r>
+      <w:r>
+        <w:t xml:space="preserve"> </w:t>
+      </w:r>
+      <w:r>
+        <w:t xml:space="preserve">— a coturn instance on a separate Linux/BSD host, or a</w:t>
+      </w:r>
+      <w:r>
+        <w:t xml:space="preserve"> </w:t>
+      </w:r>
+      <w:r>
+        <w:t xml:space="preserve">managed TURN provider — and leave</w:t>
+      </w:r>
+      <w:r>
+        <w:t xml:space="preserve"> </w:t>
+      </w:r>
+      <w:r>
+        <w:rPr>
+          <w:rStyle w:val="VerbatimChar"/>
+        </w:rPr>
+        <w:t xml:space="preserve">CIVICCAST_COTURN_COMMAND</w:t>
+      </w:r>
+      <w:r>
+        <w:t xml:space="preserve"> </w:t>
+      </w:r>
+      <w:r>
+        <w:t xml:space="preserve">unset. The</w:t>
+      </w:r>
+      <w:r>
+        <w:t xml:space="preserve"> </w:t>
+      </w:r>
+      <w:r>
+        <w:t xml:space="preserve">operator console’s Remote Contribution screen (Diagnostics drawer,</w:t>
+      </w:r>
+      <w:r>
+        <w:t xml:space="preserve"> </w:t>
+      </w:r>
+      <w:r>
+        <w:t xml:space="preserve">support_admin role) shows the currently-configured host/port, a</w:t>
+      </w:r>
+      <w:r>
+        <w:t xml:space="preserve"> </w:t>
+      </w:r>
+      <w:r>
+        <w:rPr>
+          <w:b/>
+          <w:bCs/>
+        </w:rPr>
+        <w:t xml:space="preserve">Test TURN</w:t>
+      </w:r>
+      <w:r>
+        <w:rPr>
+          <w:b/>
+          <w:bCs/>
+        </w:rPr>
+        <w:t xml:space="preserve"> </w:t>
+      </w:r>
+      <w:r>
+        <w:rPr>
+          <w:b/>
+          <w:bCs/>
+        </w:rPr>
+        <w:t xml:space="preserve">connectivity</w:t>
+      </w:r>
+      <w:r>
+        <w:t xml:space="preserve"> </w:t>
+      </w:r>
+      <w:r>
+        <w:t xml:space="preserve">button that probes it right now, and the same guidance text</w:t>
+      </w:r>
+      <w:r>
+        <w:t xml:space="preserve"> </w:t>
+      </w:r>
+      <w:r>
+        <w:t xml:space="preserve">under</w:t>
+      </w:r>
+      <w:r>
+        <w:t xml:space="preserve"> </w:t>
+      </w:r>
+      <w:r>
+        <w:t xml:space="preserve">“How to point this station at coturn.”</w:t>
+      </w:r>
+      <w:r>
+        <w:t xml:space="preserve"> </w:t>
+      </w:r>
+      <w:r>
+        <w:t xml:space="preserve">On Linux/macOS these still</w:t>
+      </w:r>
+      <w:r>
+        <w:t xml:space="preserve"> </w:t>
+      </w:r>
+      <w:r>
+        <w:t xml:space="preserve">work the same way if you’d rather point at an external server than run</w:t>
+      </w:r>
+      <w:r>
+        <w:t xml:space="preserve"> </w:t>
+      </w:r>
+      <w:r>
+        <w:t xml:space="preserve">coturn locally.</w:t>
       </w:r>
     </w:p>
     <w:p>
@@ -7898,36 +8066,46 @@
           <w:b/>
           <w:bCs/>
         </w:rPr>
-        <w:t xml:space="preserve">CIVICCAST_TURN_PORT</w:t>
-      </w:r>
-      <w:r>
-        <w:br/>
-      </w:r>
-      <w:r>
-        <w:t xml:space="preserve">TURN/VDO co-process commands.</w:t>
-      </w:r>
-    </w:p>
-    <w:p>
-      <w:pPr>
-        <w:pStyle w:val="Compact"/>
-        <w:numPr>
-          <w:ilvl w:val="0"/>
-          <w:numId w:val="1020"/>
-        </w:numPr>
-      </w:pPr>
-      <w:r>
-        <w:rPr>
-          <w:rStyle w:val="VerbatimChar"/>
-          <w:b/>
-          <w:bCs/>
-        </w:rPr>
         <w:t xml:space="preserve">CIVICCAST_COTURN_COMMAND</w:t>
       </w:r>
       <w:r>
         <w:br/>
       </w:r>
       <w:r>
-        <w:t xml:space="preserve">TURN/VDO co-process commands.</w:t>
+        <w:t xml:space="preserve">Linux/macOS only — the local coturn launch command, if you’re running</w:t>
+      </w:r>
+      <w:r>
+        <w:t xml:space="preserve"> </w:t>
+      </w:r>
+      <w:r>
+        <w:t xml:space="preserve">coturn on the station itself rather than pointing at an external server</w:t>
+      </w:r>
+      <w:r>
+        <w:t xml:space="preserve"> </w:t>
+      </w:r>
+      <w:r>
+        <w:t xml:space="preserve">(see</w:t>
+      </w:r>
+      <w:r>
+        <w:t xml:space="preserve"> </w:t>
+      </w:r>
+      <w:r>
+        <w:rPr>
+          <w:rStyle w:val="VerbatimChar"/>
+        </w:rPr>
+        <w:t xml:space="preserve">CIVICCAST_TURN_HOST</w:t>
+      </w:r>
+      <w:r>
+        <w:t xml:space="preserve"> </w:t>
+      </w:r>
+      <w:r>
+        <w:t xml:space="preserve">above). Leave unset on Windows; there is no</w:t>
+      </w:r>
+      <w:r>
+        <w:t xml:space="preserve"> </w:t>
+      </w:r>
+      <w:r>
+        <w:t xml:space="preserve">native Windows build.</w:t>
       </w:r>
     </w:p>
     <w:p>

</xml_diff>

<commit_message>
style: fix lint and regenerate rendered docs for the setup-nonce retirement
- ruff check/format: import-sort in test_first_run_seed.py and
  test_installer_api.py (my bulk header-strip left an unsorted import
  block), plus format-only fixes in generate-openapi-artifacts.py,
  run_isolated_first_run_attestation.py, and test_rate_limit.py.
- docs/USER-MANUAL.pdf, docs/USER-MANUAL.docx, docs/USER-MANUAL.render.json
  regenerated via scripts/render_user_manual.py from the retired-nonce
  USER-MANUAL.md text (the tracked-artifact hash was stale after that
  edit); render_user_manual.py --check-current now passes.

Signed-off-by: Scott Converse <sconverse@gmail.com>
Co-authored-by: Claude Opus 5 <noreply@anthropic.com>
</commit_message>
<xml_diff>
--- a/docs/USER-MANUAL.docx
+++ b/docs/USER-MANUAL.docx
@@ -3628,52 +3628,6 @@
       </w:r>
       <w:r>
         <w:t xml:space="preserve">— Reported and update-checked version pins.</w:t>
-      </w:r>
-    </w:p>
-    <w:p>
-      <w:pPr>
-        <w:pStyle w:val="Compact"/>
-        <w:numPr>
-          <w:ilvl w:val="0"/>
-          <w:numId w:val="1009"/>
-        </w:numPr>
-      </w:pPr>
-      <w:r>
-        <w:rPr>
-          <w:rStyle w:val="VerbatimChar"/>
-          <w:b/>
-          <w:bCs/>
-        </w:rPr>
-        <w:t xml:space="preserve">CIVICCAST_SETUP_NONCE</w:t>
-      </w:r>
-      <w:r>
-        <w:t xml:space="preserve"> </w:t>
-      </w:r>
-      <w:r>
-        <w:t xml:space="preserve">— First-run protection for the setup wizard.</w:t>
-      </w:r>
-    </w:p>
-    <w:p>
-      <w:pPr>
-        <w:pStyle w:val="Compact"/>
-        <w:numPr>
-          <w:ilvl w:val="0"/>
-          <w:numId w:val="1009"/>
-        </w:numPr>
-      </w:pPr>
-      <w:r>
-        <w:rPr>
-          <w:rStyle w:val="VerbatimChar"/>
-          <w:b/>
-          <w:bCs/>
-        </w:rPr>
-        <w:t xml:space="preserve">CIVICCAST_REQUIRE_SETUP_NONCE</w:t>
-      </w:r>
-      <w:r>
-        <w:t xml:space="preserve"> </w:t>
-      </w:r>
-      <w:r>
-        <w:t xml:space="preserve">— First-run protection for the setup wizard.</w:t>
       </w:r>
     </w:p>
     <w:p>

</xml_diff>

<commit_message>
feat(installer): support data-preserving in-place upgrades
Signed-off-by: Scott Converse <1474146+scottconverse@users.noreply.github.com>
</commit_message>
<xml_diff>
--- a/docs/USER-MANUAL.docx
+++ b/docs/USER-MANUAL.docx
@@ -6990,7 +6990,7 @@
         <w:pStyle w:val="Heading3"/>
       </w:pPr>
       <w:r>
-        <w:t xml:space="preserve">Updating To A New Version — Uninstall First</w:t>
+        <w:t xml:space="preserve">Updating To A New Version</w:t>
       </w:r>
     </w:p>
     <w:p>
@@ -6998,83 +6998,35 @@
         <w:pStyle w:val="FirstParagraph"/>
       </w:pPr>
       <w:r>
-        <w:t xml:space="preserve">The Windows installer is</w:t>
-      </w:r>
-      <w:r>
-        <w:t xml:space="preserve"> </w:t>
-      </w:r>
-      <w:r>
-        <w:rPr>
-          <w:b/>
-          <w:bCs/>
-        </w:rPr>
-        <w:t xml:space="preserve">install-only by design</w:t>
-      </w:r>
-      <w:r>
-        <w:t xml:space="preserve">: running a new</w:t>
-      </w:r>
-      <w:r>
-        <w:t xml:space="preserve"> </w:t>
-      </w:r>
-      <w:r>
-        <w:t xml:space="preserve">installer</w:t>
-      </w:r>
-      <w:r>
-        <w:t xml:space="preserve"> </w:t>
-      </w:r>
-      <w:r>
-        <w:rPr>
-          <w:rStyle w:val="VerbatimChar"/>
-        </w:rPr>
-        <w:t xml:space="preserve">.exe</w:t>
-      </w:r>
-      <w:r>
-        <w:t xml:space="preserve"> </w:t>
-      </w:r>
-      <w:r>
-        <w:t xml:space="preserve">over an existing, live CivicCast (Native) install refuses</w:t>
-      </w:r>
-      <w:r>
-        <w:t xml:space="preserve"> </w:t>
-      </w:r>
-      <w:r>
-        <w:t xml:space="preserve">loudly and makes no changes, rather than attempting an in-place upgrade</w:t>
-      </w:r>
-      <w:r>
-        <w:t xml:space="preserve"> </w:t>
-      </w:r>
-      <w:r>
-        <w:t xml:space="preserve">while the service is running (see</w:t>
-      </w:r>
-      <w:r>
-        <w:t xml:space="preserve"> </w:t>
-      </w:r>
-      <w:r>
-        <w:rPr>
-          <w:rStyle w:val="VerbatimChar"/>
-        </w:rPr>
-        <w:t xml:space="preserve">civiccast/apps/installer/src-tauri/nsis-hooks-bootstrap.nsh</w:t>
-      </w:r>
-      <w:r>
-        <w:t xml:space="preserve">, the</w:t>
-      </w:r>
-      <w:r>
-        <w:t xml:space="preserve"> </w:t>
-      </w:r>
-      <w:r>
-        <w:t xml:space="preserve">“install-only refusal”</w:t>
-      </w:r>
-      <w:r>
-        <w:t xml:space="preserve"> </w:t>
-      </w:r>
-      <w:r>
-        <w:t xml:space="preserve">preinstall check). The documented, and only</w:t>
-      </w:r>
-      <w:r>
-        <w:t xml:space="preserve"> </w:t>
-      </w:r>
-      <w:r>
-        <w:t xml:space="preserve">supported, update path is:</w:t>
+        <w:t xml:space="preserve">Use the complete new CivicCast kit and run its installer directly on the</w:t>
+      </w:r>
+      <w:r>
+        <w:t xml:space="preserve"> </w:t>
+      </w:r>
+      <w:r>
+        <w:t xml:space="preserve">station that already has CivicCast (Native) installed. You do</w:t>
+      </w:r>
+      <w:r>
+        <w:t xml:space="preserve"> </w:t>
+      </w:r>
+      <w:r>
+        <w:rPr>
+          <w:b/>
+          <w:bCs/>
+        </w:rPr>
+        <w:t xml:space="preserve">not</w:t>
+      </w:r>
+      <w:r>
+        <w:t xml:space="preserve"> </w:t>
+      </w:r>
+      <w:r>
+        <w:t xml:space="preserve">need to</w:t>
+      </w:r>
+      <w:r>
+        <w:t xml:space="preserve"> </w:t>
+      </w:r>
+      <w:r>
+        <w:t xml:space="preserve">uninstall the current version first.</w:t>
       </w:r>
     </w:p>
     <w:p>
@@ -7086,79 +7038,130 @@
         </w:numPr>
       </w:pPr>
       <w:r>
-        <w:rPr>
-          <w:b/>
-          <w:bCs/>
-        </w:rPr>
-        <w:t xml:space="preserve">Uninstall the current version first</w:t>
-      </w:r>
-      <w:r>
-        <w:t xml:space="preserve">, from Windows</w:t>
-      </w:r>
-      <w:r>
-        <w:t xml:space="preserve"> </w:t>
-      </w:r>
-      <w:r>
-        <w:rPr>
-          <w:b/>
-          <w:bCs/>
-        </w:rPr>
-        <w:t xml:space="preserve">Settings →</w:t>
-      </w:r>
-      <w:r>
-        <w:rPr>
-          <w:b/>
-          <w:bCs/>
-        </w:rPr>
-        <w:t xml:space="preserve"> </w:t>
-      </w:r>
-      <w:r>
-        <w:rPr>
-          <w:b/>
-          <w:bCs/>
-        </w:rPr>
-        <w:t xml:space="preserve">Apps</w:t>
-      </w:r>
-      <w:r>
-        <w:t xml:space="preserve">. Leave the</w:t>
-      </w:r>
-      <w:r>
-        <w:t xml:space="preserve"> </w:t>
-      </w:r>
-      <w:r>
-        <w:rPr>
-          <w:b/>
-          <w:bCs/>
-        </w:rPr>
-        <w:t xml:space="preserve">“Delete the application data”</w:t>
-      </w:r>
-      <w:r>
-        <w:t xml:space="preserve"> </w:t>
-      </w:r>
-      <w:r>
-        <w:t xml:space="preserve">checkbox</w:t>
-      </w:r>
-      <w:r>
-        <w:t xml:space="preserve"> </w:t>
-      </w:r>
-      <w:r>
-        <w:rPr>
-          <w:b/>
-          <w:bCs/>
-        </w:rPr>
-        <w:t xml:space="preserve">unchecked</w:t>
-      </w:r>
-      <w:r>
-        <w:t xml:space="preserve"> </w:t>
-      </w:r>
-      <w:r>
-        <w:t xml:space="preserve">— leaving it unchecked preserves your recordings,</w:t>
-      </w:r>
-      <w:r>
-        <w:t xml:space="preserve"> </w:t>
-      </w:r>
-      <w:r>
-        <w:t xml:space="preserve">database, and settings under</w:t>
+        <w:t xml:space="preserve">Before the maintenance window, save a current recovery kit and confirm</w:t>
+      </w:r>
+      <w:r>
+        <w:t xml:space="preserve"> </w:t>
+      </w:r>
+      <w:r>
+        <w:t xml:space="preserve">your normal station backup is available.</w:t>
+      </w:r>
+    </w:p>
+    <w:p>
+      <w:pPr>
+        <w:pStyle w:val="Compact"/>
+        <w:numPr>
+          <w:ilvl w:val="0"/>
+          <w:numId w:val="1015"/>
+        </w:numPr>
+      </w:pPr>
+      <w:r>
+        <w:t xml:space="preserve">Stop active meetings, recordings, publishing jobs, and other operator</w:t>
+      </w:r>
+      <w:r>
+        <w:t xml:space="preserve"> </w:t>
+      </w:r>
+      <w:r>
+        <w:t xml:space="preserve">work. Close the CivicCast desktop window.</w:t>
+      </w:r>
+    </w:p>
+    <w:p>
+      <w:pPr>
+        <w:pStyle w:val="Compact"/>
+        <w:numPr>
+          <w:ilvl w:val="0"/>
+          <w:numId w:val="1015"/>
+        </w:numPr>
+      </w:pPr>
+      <w:r>
+        <w:t xml:space="preserve">Keep the new</w:t>
+      </w:r>
+      <w:r>
+        <w:t xml:space="preserve"> </w:t>
+      </w:r>
+      <w:r>
+        <w:rPr>
+          <w:rStyle w:val="VerbatimChar"/>
+        </w:rPr>
+        <w:t xml:space="preserve">setup.exe</w:t>
+      </w:r>
+      <w:r>
+        <w:t xml:space="preserve">, its</w:t>
+      </w:r>
+      <w:r>
+        <w:t xml:space="preserve"> </w:t>
+      </w:r>
+      <w:r>
+        <w:rPr>
+          <w:rStyle w:val="VerbatimChar"/>
+        </w:rPr>
+        <w:t xml:space="preserve">packs</w:t>
+      </w:r>
+      <w:r>
+        <w:t xml:space="preserve"> </w:t>
+      </w:r>
+      <w:r>
+        <w:t xml:space="preserve">folder, and its</w:t>
+      </w:r>
+      <w:r>
+        <w:t xml:space="preserve"> </w:t>
+      </w:r>
+      <w:r>
+        <w:rPr>
+          <w:rStyle w:val="VerbatimChar"/>
+        </w:rPr>
+        <w:t xml:space="preserve">station</w:t>
+      </w:r>
+      <w:r>
+        <w:t xml:space="preserve"> </w:t>
+      </w:r>
+      <w:r>
+        <w:t xml:space="preserve">folder</w:t>
+      </w:r>
+      <w:r>
+        <w:t xml:space="preserve"> </w:t>
+      </w:r>
+      <w:r>
+        <w:t xml:space="preserve">together, then run</w:t>
+      </w:r>
+      <w:r>
+        <w:t xml:space="preserve"> </w:t>
+      </w:r>
+      <w:r>
+        <w:rPr>
+          <w:rStyle w:val="VerbatimChar"/>
+        </w:rPr>
+        <w:t xml:space="preserve">setup.exe</w:t>
+      </w:r>
+      <w:r>
+        <w:t xml:space="preserve"> </w:t>
+      </w:r>
+      <w:r>
+        <w:t xml:space="preserve">as an administrator.</w:t>
+      </w:r>
+    </w:p>
+    <w:p>
+      <w:pPr>
+        <w:pStyle w:val="Compact"/>
+        <w:numPr>
+          <w:ilvl w:val="0"/>
+          <w:numId w:val="1015"/>
+        </w:numPr>
+      </w:pPr>
+      <w:r>
+        <w:t xml:space="preserve">Setup detects the existing install and asks the old CivicCast bootstrap to</w:t>
+      </w:r>
+      <w:r>
+        <w:t xml:space="preserve"> </w:t>
+      </w:r>
+      <w:r>
+        <w:t xml:space="preserve">stop and unregister its native service state before replacing application</w:t>
+      </w:r>
+      <w:r>
+        <w:t xml:space="preserve"> </w:t>
+      </w:r>
+      <w:r>
+        <w:t xml:space="preserve">files. It preserves</w:t>
       </w:r>
       <w:r>
         <w:t xml:space="preserve"> </w:t>
@@ -7170,13 +7173,19 @@
         <w:t xml:space="preserve">C:\ProgramData\CivicCast</w:t>
       </w:r>
       <w:r>
-        <w:t xml:space="preserve">. (Checking that</w:t>
-      </w:r>
-      <w:r>
-        <w:t xml:space="preserve"> </w:t>
-      </w:r>
-      <w:r>
-        <w:t xml:space="preserve">box does the opposite: it deletes everything, including recordings.)</w:t>
+        <w:t xml:space="preserve">, including recordings,</w:t>
+      </w:r>
+      <w:r>
+        <w:t xml:space="preserve"> </w:t>
+      </w:r>
+      <w:r>
+        <w:t xml:space="preserve">database data, and station settings. The new version then adopts that data</w:t>
+      </w:r>
+      <w:r>
+        <w:t xml:space="preserve"> </w:t>
+      </w:r>
+      <w:r>
+        <w:t xml:space="preserve">and migrates its database schema.</w:t>
       </w:r>
     </w:p>
     <w:p>
@@ -7188,23 +7197,66 @@
         </w:numPr>
       </w:pPr>
       <w:r>
-        <w:rPr>
-          <w:b/>
-          <w:bCs/>
-        </w:rPr>
-        <w:t xml:space="preserve">Run the new version’s installer.</w:t>
-      </w:r>
-      <w:r>
-        <w:t xml:space="preserve"> </w:t>
-      </w:r>
-      <w:r>
-        <w:t xml:space="preserve">The fresh install detects the</w:t>
-      </w:r>
-      <w:r>
-        <w:t xml:space="preserve"> </w:t>
-      </w:r>
-      <w:r>
-        <w:t xml:space="preserve">preserved data under</w:t>
+        <w:t xml:space="preserve">Confirm</w:t>
+      </w:r>
+      <w:r>
+        <w:t xml:space="preserve"> </w:t>
+      </w:r>
+      <w:r>
+        <w:rPr>
+          <w:b/>
+          <w:bCs/>
+        </w:rPr>
+        <w:t xml:space="preserve">System Health</w:t>
+      </w:r>
+      <w:r>
+        <w:t xml:space="preserve"> </w:t>
+      </w:r>
+      <w:r>
+        <w:t xml:space="preserve">is green and spot-check a known recording in</w:t>
+      </w:r>
+      <w:r>
+        <w:t xml:space="preserve"> </w:t>
+      </w:r>
+      <w:r>
+        <w:rPr>
+          <w:b/>
+          <w:bCs/>
+        </w:rPr>
+        <w:t xml:space="preserve">Assets</w:t>
+      </w:r>
+      <w:r>
+        <w:t xml:space="preserve"> </w:t>
+      </w:r>
+      <w:r>
+        <w:t xml:space="preserve">before resuming station use.</w:t>
+      </w:r>
+    </w:p>
+    <w:p>
+      <w:pPr>
+        <w:pStyle w:val="FirstParagraph"/>
+      </w:pPr>
+      <w:r>
+        <w:t xml:space="preserve">If setup cannot prove that the old service was safely stopped, it exits with</w:t>
+      </w:r>
+      <w:r>
+        <w:t xml:space="preserve"> </w:t>
+      </w:r>
+      <w:r>
+        <w:t xml:space="preserve">an error</w:t>
+      </w:r>
+      <w:r>
+        <w:t xml:space="preserve"> </w:t>
+      </w:r>
+      <w:r>
+        <w:rPr>
+          <w:b/>
+          <w:bCs/>
+        </w:rPr>
+        <w:t xml:space="preserve">before replacing application files</w:t>
+      </w:r>
+      <w:r>
+        <w:t xml:space="preserve">. Do not delete</w:t>
       </w:r>
       <w:r>
         <w:t xml:space="preserve"> </w:t>
@@ -7216,98 +7268,66 @@
         <w:t xml:space="preserve">C:\ProgramData\CivicCast</w:t>
       </w:r>
       <w:r>
-        <w:t xml:space="preserve"> </w:t>
-      </w:r>
-      <w:r>
-        <w:t xml:space="preserve">and adopts it —</w:t>
-      </w:r>
-      <w:r>
-        <w:t xml:space="preserve"> </w:t>
-      </w:r>
-      <w:r>
-        <w:t xml:space="preserve">including its database — automatically, then upgrades the database</w:t>
-      </w:r>
-      <w:r>
-        <w:t xml:space="preserve"> </w:t>
-      </w:r>
-      <w:r>
-        <w:t xml:space="preserve">schema in place.</w:t>
-      </w:r>
-    </w:p>
-    <w:p>
-      <w:pPr>
-        <w:pStyle w:val="Compact"/>
-        <w:numPr>
-          <w:ilvl w:val="0"/>
-          <w:numId w:val="1015"/>
-        </w:numPr>
-      </w:pPr>
-      <w:r>
-        <w:t xml:space="preserve">Confirm</w:t>
-      </w:r>
-      <w:r>
-        <w:t xml:space="preserve"> </w:t>
-      </w:r>
-      <w:r>
-        <w:rPr>
-          <w:b/>
-          <w:bCs/>
-        </w:rPr>
-        <w:t xml:space="preserve">System Health</w:t>
-      </w:r>
-      <w:r>
-        <w:t xml:space="preserve"> </w:t>
-      </w:r>
-      <w:r>
-        <w:t xml:space="preserve">is green and spot-check a known recording is</w:t>
-      </w:r>
-      <w:r>
-        <w:t xml:space="preserve"> </w:t>
-      </w:r>
-      <w:r>
-        <w:t xml:space="preserve">still present in</w:t>
-      </w:r>
-      <w:r>
-        <w:t xml:space="preserve"> </w:t>
-      </w:r>
-      <w:r>
-        <w:rPr>
-          <w:b/>
-          <w:bCs/>
-        </w:rPr>
-        <w:t xml:space="preserve">Assets</w:t>
-      </w:r>
-      <w:r>
-        <w:t xml:space="preserve"> </w:t>
-      </w:r>
-      <w:r>
-        <w:t xml:space="preserve">before resuming station use.</w:t>
-      </w:r>
-    </w:p>
-    <w:p>
-      <w:pPr>
-        <w:pStyle w:val="FirstParagraph"/>
-      </w:pPr>
-      <w:r>
-        <w:t xml:space="preserve">Do not try to run a new installer directly over a live install expecting</w:t>
-      </w:r>
-      <w:r>
-        <w:t xml:space="preserve"> </w:t>
-      </w:r>
-      <w:r>
-        <w:t xml:space="preserve">it to upgrade in place; it will refuse and leave the running station</w:t>
-      </w:r>
-      <w:r>
-        <w:t xml:space="preserve"> </w:t>
-      </w:r>
-      <w:r>
-        <w:t xml:space="preserve">untouched, which is the intended fail-closed behavior — not a bug to work</w:t>
-      </w:r>
-      <w:r>
-        <w:t xml:space="preserve"> </w:t>
-      </w:r>
-      <w:r>
-        <w:t xml:space="preserve">around.</w:t>
+        <w:t xml:space="preserve">; retain the installer log at</w:t>
+      </w:r>
+      <w:r>
+        <w:t xml:space="preserve"> </w:t>
+      </w:r>
+      <w:r>
+        <w:rPr>
+          <w:rStyle w:val="VerbatimChar"/>
+        </w:rPr>
+        <w:t xml:space="preserve">C:\ProgramData\CivicCast\install-progress.log</w:t>
+      </w:r>
+      <w:r>
+        <w:t xml:space="preserve"> </w:t>
+      </w:r>
+      <w:r>
+        <w:t xml:space="preserve">and resolve the reported</w:t>
+      </w:r>
+      <w:r>
+        <w:t xml:space="preserve"> </w:t>
+      </w:r>
+      <w:r>
+        <w:t xml:space="preserve">service error before retrying.</w:t>
+      </w:r>
+    </w:p>
+    <w:p>
+      <w:pPr>
+        <w:pStyle w:val="BodyText"/>
+      </w:pPr>
+      <w:r>
+        <w:t xml:space="preserve">The Windows uninstall entry remains available for intentionally removing the</w:t>
+      </w:r>
+      <w:r>
+        <w:t xml:space="preserve"> </w:t>
+      </w:r>
+      <w:r>
+        <w:t xml:space="preserve">application. Uninstall removes application/runtime files but deliberately</w:t>
+      </w:r>
+      <w:r>
+        <w:t xml:space="preserve"> </w:t>
+      </w:r>
+      <w:r>
+        <w:t xml:space="preserve">leaves recordings, database data, and station settings in</w:t>
+      </w:r>
+      <w:r>
+        <w:t xml:space="preserve"> </w:t>
+      </w:r>
+      <w:r>
+        <w:rPr>
+          <w:rStyle w:val="VerbatimChar"/>
+        </w:rPr>
+        <w:t xml:space="preserve">C:\ProgramData\CivicCast</w:t>
+      </w:r>
+      <w:r>
+        <w:t xml:space="preserve">. Its optional checkbox concerns the signed-in</w:t>
+      </w:r>
+      <w:r>
+        <w:t xml:space="preserve"> </w:t>
+      </w:r>
+      <w:r>
+        <w:t xml:space="preserve">account’s saved installer preferences; it is not a data-purge control.</w:t>
       </w:r>
     </w:p>
     <w:bookmarkEnd w:id="51"/>

</xml_diff>

<commit_message>
fix(installer): harden cross-version upgrade gate
Signed-off-by: Scott Converse <1474146+scottconverse@users.noreply.github.com>
</commit_message>
<xml_diff>
--- a/docs/USER-MANUAL.docx
+++ b/docs/USER-MANUAL.docx
@@ -15,7 +15,7 @@
         <w:pStyle w:val="Subtitle"/>
       </w:pPr>
       <w:r>
-        <w:t xml:space="preserve">For station operators, clerks, and IT staff · v1.0.0-beta.1 (native Windows line)</w:t>
+        <w:t xml:space="preserve">For station operators, clerks, and IT staff - v1.0.0-beta.2 (native Windows line)</w:t>
       </w:r>
     </w:p>
     <w:p>
@@ -330,7 +330,7 @@
         <w:rPr>
           <w:rStyle w:val="VerbatimChar"/>
         </w:rPr>
-        <w:t xml:space="preserve">v1.0.0-beta.1</w:t>
+        <w:t xml:space="preserve">v1.0.0-beta.2</w:t>
       </w:r>
       <w:r>
         <w:t xml:space="preserve"> </w:t>
@@ -342,7 +342,7 @@
         <w:t xml:space="preserve"> </w:t>
       </w:r>
       <w:r>
-        <w:t xml:space="preserve">candidate (an owner-held candidate, not yet a published release) described in</w:t>
+        <w:t xml:space="preserve">candidate (an owner-held unpublished candidate) described in</w:t>
       </w:r>
       <w:r>
         <w:t xml:space="preserve"> </w:t>

</xml_diff>

<commit_message>
docs: re-render USER-MANUAL pdf/docx manifests for beta.4
Signed-off-by: Claude Fable 5.1 <noreply@anthropic.com>
Co-Authored-By: Claude Fable 5.1 <noreply@anthropic.com>
</commit_message>
<xml_diff>
--- a/docs/USER-MANUAL.docx
+++ b/docs/USER-MANUAL.docx
@@ -351,19 +351,46 @@
         <w:rPr>
           <w:rStyle w:val="VerbatimChar"/>
         </w:rPr>
+        <w:t xml:space="preserve">v1.0.0-beta.4</w:t>
+      </w:r>
+      <w:r>
+        <w:t xml:space="preserve"> </w:t>
+      </w:r>
+      <w:r>
+        <w:t xml:space="preserve">is the current</w:t>
+      </w:r>
+      <w:r>
+        <w:t xml:space="preserve"> </w:t>
+      </w:r>
+      <w:r>
+        <w:t xml:space="preserve">published release described in this manual, a download-only upgrade for</w:t>
+      </w:r>
+      <w:r>
+        <w:t xml:space="preserve"> </w:t>
+      </w:r>
+      <w:r>
+        <w:t xml:space="preserve">stations already on</w:t>
+      </w:r>
+      <w:r>
+        <w:t xml:space="preserve"> </w:t>
+      </w:r>
+      <w:r>
+        <w:rPr>
+          <w:rStyle w:val="VerbatimChar"/>
+        </w:rPr>
         <w:t xml:space="preserve">v1.0.0-beta.3</w:t>
       </w:r>
       <w:r>
         <w:t xml:space="preserve"> </w:t>
       </w:r>
       <w:r>
-        <w:t xml:space="preserve">is the current</w:t>
-      </w:r>
-      <w:r>
-        <w:t xml:space="preserve"> </w:t>
-      </w:r>
-      <w:r>
-        <w:t xml:space="preserve">published release (CivicCast’s first downloadable one – see</w:t>
+        <w:t xml:space="preserve">(CivicCast’s first downloadable</w:t>
+      </w:r>
+      <w:r>
+        <w:t xml:space="preserve"> </w:t>
+      </w:r>
+      <w:r>
+        <w:t xml:space="preserve">release, now superseded – see</w:t>
       </w:r>
       <w:r>
         <w:t xml:space="preserve"> </w:t>
@@ -383,34 +410,7 @@
         <w:t xml:space="preserve"> </w:t>
       </w:r>
       <w:r>
-        <w:rPr>
-          <w:rStyle w:val="VerbatimChar"/>
-        </w:rPr>
-        <w:t xml:space="preserve">v1.0.0-beta.4</w:t>
-      </w:r>
-      <w:r>
-        <w:t xml:space="preserve"> </w:t>
-      </w:r>
-      <w:r>
-        <w:t xml:space="preserve">is the next candidate and the current native-Windows</w:t>
-      </w:r>
-      <w:r>
-        <w:t xml:space="preserve"> </w:t>
-      </w:r>
-      <w:r>
-        <w:t xml:space="preserve">development candidate (an owner-held unpublished candidate) described in</w:t>
-      </w:r>
-      <w:r>
-        <w:t xml:space="preserve"> </w:t>
-      </w:r>
-      <w:r>
-        <w:t xml:space="preserve">this manual; it does not change the beta.3 install story. It is a fresh,</w:t>
-      </w:r>
-      <w:r>
-        <w:t xml:space="preserve"> </w:t>
-      </w:r>
-      <w:r>
-        <w:t xml:space="preserve">from-scratch native Windows product line — its</w:t>
+        <w:t xml:space="preserve">It is a fresh, from-scratch native Windows product line — its</w:t>
       </w:r>
       <w:r>
         <w:t xml:space="preserve"> </w:t>

</xml_diff>

<commit_message>
docs: draft v1.0.0-beta.4 release documentation (pending tonight's Gate A) (#157)
Merged on green (mutation-report informational: mutmut diff-scope config error on a docs-heavy diff).
</commit_message>
<xml_diff>
--- a/docs/USER-MANUAL.docx
+++ b/docs/USER-MANUAL.docx
@@ -351,19 +351,46 @@
         <w:rPr>
           <w:rStyle w:val="VerbatimChar"/>
         </w:rPr>
+        <w:t xml:space="preserve">v1.0.0-beta.4</w:t>
+      </w:r>
+      <w:r>
+        <w:t xml:space="preserve"> </w:t>
+      </w:r>
+      <w:r>
+        <w:t xml:space="preserve">is the current</w:t>
+      </w:r>
+      <w:r>
+        <w:t xml:space="preserve"> </w:t>
+      </w:r>
+      <w:r>
+        <w:t xml:space="preserve">published release described in this manual, a download-only upgrade for</w:t>
+      </w:r>
+      <w:r>
+        <w:t xml:space="preserve"> </w:t>
+      </w:r>
+      <w:r>
+        <w:t xml:space="preserve">stations already on</w:t>
+      </w:r>
+      <w:r>
+        <w:t xml:space="preserve"> </w:t>
+      </w:r>
+      <w:r>
+        <w:rPr>
+          <w:rStyle w:val="VerbatimChar"/>
+        </w:rPr>
         <w:t xml:space="preserve">v1.0.0-beta.3</w:t>
       </w:r>
       <w:r>
         <w:t xml:space="preserve"> </w:t>
       </w:r>
       <w:r>
-        <w:t xml:space="preserve">is the current</w:t>
-      </w:r>
-      <w:r>
-        <w:t xml:space="preserve"> </w:t>
-      </w:r>
-      <w:r>
-        <w:t xml:space="preserve">published release (CivicCast’s first downloadable one – see</w:t>
+        <w:t xml:space="preserve">(CivicCast’s first downloadable</w:t>
+      </w:r>
+      <w:r>
+        <w:t xml:space="preserve"> </w:t>
+      </w:r>
+      <w:r>
+        <w:t xml:space="preserve">release, now superseded – see</w:t>
       </w:r>
       <w:r>
         <w:t xml:space="preserve"> </w:t>
@@ -383,34 +410,7 @@
         <w:t xml:space="preserve"> </w:t>
       </w:r>
       <w:r>
-        <w:rPr>
-          <w:rStyle w:val="VerbatimChar"/>
-        </w:rPr>
-        <w:t xml:space="preserve">v1.0.0-beta.4</w:t>
-      </w:r>
-      <w:r>
-        <w:t xml:space="preserve"> </w:t>
-      </w:r>
-      <w:r>
-        <w:t xml:space="preserve">is the next candidate and the current native-Windows</w:t>
-      </w:r>
-      <w:r>
-        <w:t xml:space="preserve"> </w:t>
-      </w:r>
-      <w:r>
-        <w:t xml:space="preserve">development candidate (an owner-held unpublished candidate) described in</w:t>
-      </w:r>
-      <w:r>
-        <w:t xml:space="preserve"> </w:t>
-      </w:r>
-      <w:r>
-        <w:t xml:space="preserve">this manual; it does not change the beta.3 install story. It is a fresh,</w:t>
-      </w:r>
-      <w:r>
-        <w:t xml:space="preserve"> </w:t>
-      </w:r>
-      <w:r>
-        <w:t xml:space="preserve">from-scratch native Windows product line — its</w:t>
+        <w:t xml:space="preserve">It is a fresh, from-scratch native Windows product line — its</w:t>
       </w:r>
       <w:r>
         <w:t xml:space="preserve"> </w:t>

</xml_diff>

<commit_message>
docs: re-render USER-MANUAL pdf/docx and docsite manual manifest for beta.5
The prior commit staged the conflict-resolved manual sources but carried
over the ours-side (pre-merge) rendered PDF/DOCX and JSON manifests
unchanged. Actually re-run render_user_manual.py --out-dir docs and
render_docsite_manual.py against docs/USER-MANUAL.md's beta.5 subtitle so
the tracked artifacts match their source again; --check-current now passes
for both.

Signed-off-by: Claude Fable 5.1 <noreply@anthropic.com>
Co-Authored-By: Claude Fable 5.1 <noreply@anthropic.com>
</commit_message>
<xml_diff>
--- a/docs/USER-MANUAL.docx
+++ b/docs/USER-MANUAL.docx
@@ -15,7 +15,7 @@
         <w:pStyle w:val="Subtitle"/>
       </w:pPr>
       <w:r>
-        <w:t xml:space="preserve">For station operators, clerks, and IT staff - v1.0.0-beta.4 (native Windows line)</w:t>
+        <w:t xml:space="preserve">For station operators, clerks, and IT staff - v1.0.0-beta.5 (native Windows line)</w:t>
       </w:r>
     </w:p>
     <w:p>
@@ -410,7 +410,34 @@
         <w:t xml:space="preserve"> </w:t>
       </w:r>
       <w:r>
-        <w:t xml:space="preserve">It is a fresh, from-scratch native Windows product line — its</w:t>
+        <w:rPr>
+          <w:rStyle w:val="VerbatimChar"/>
+        </w:rPr>
+        <w:t xml:space="preserve">v1.0.0-beta.5</w:t>
+      </w:r>
+      <w:r>
+        <w:t xml:space="preserve"> </w:t>
+      </w:r>
+      <w:r>
+        <w:t xml:space="preserve">is the next candidate and the current native-Windows</w:t>
+      </w:r>
+      <w:r>
+        <w:t xml:space="preserve"> </w:t>
+      </w:r>
+      <w:r>
+        <w:t xml:space="preserve">development candidate (an owner-held unpublished candidate) described in</w:t>
+      </w:r>
+      <w:r>
+        <w:t xml:space="preserve"> </w:t>
+      </w:r>
+      <w:r>
+        <w:t xml:space="preserve">this manual; it does not change the beta.4 install story. It is a fresh,</w:t>
+      </w:r>
+      <w:r>
+        <w:t xml:space="preserve"> </w:t>
+      </w:r>
+      <w:r>
+        <w:t xml:space="preserve">from-scratch native Windows product line — its</w:t>
       </w:r>
       <w:r>
         <w:t xml:space="preserve"> </w:t>

</xml_diff>

<commit_message>
chore(release): 1.0.0-beta.5 identity, baseline repin to the beta.4 kit, clock-timed factory table (#164)
Merged on green (mutation-report informational: diff-scope config error on a docs/lockfile-heavy diff).
</commit_message>
<xml_diff>
--- a/docs/USER-MANUAL.docx
+++ b/docs/USER-MANUAL.docx
@@ -15,7 +15,7 @@
         <w:pStyle w:val="Subtitle"/>
       </w:pPr>
       <w:r>
-        <w:t xml:space="preserve">For station operators, clerks, and IT staff - v1.0.0-beta.4 (native Windows line)</w:t>
+        <w:t xml:space="preserve">For station operators, clerks, and IT staff - v1.0.0-beta.5 (native Windows line)</w:t>
       </w:r>
     </w:p>
     <w:p>
@@ -410,7 +410,34 @@
         <w:t xml:space="preserve"> </w:t>
       </w:r>
       <w:r>
-        <w:t xml:space="preserve">It is a fresh, from-scratch native Windows product line — its</w:t>
+        <w:rPr>
+          <w:rStyle w:val="VerbatimChar"/>
+        </w:rPr>
+        <w:t xml:space="preserve">v1.0.0-beta.5</w:t>
+      </w:r>
+      <w:r>
+        <w:t xml:space="preserve"> </w:t>
+      </w:r>
+      <w:r>
+        <w:t xml:space="preserve">is the next candidate and the current native-Windows</w:t>
+      </w:r>
+      <w:r>
+        <w:t xml:space="preserve"> </w:t>
+      </w:r>
+      <w:r>
+        <w:t xml:space="preserve">development candidate (an owner-held unpublished candidate) described in</w:t>
+      </w:r>
+      <w:r>
+        <w:t xml:space="preserve"> </w:t>
+      </w:r>
+      <w:r>
+        <w:t xml:space="preserve">this manual; it does not change the beta.4 install story. It is a fresh,</w:t>
+      </w:r>
+      <w:r>
+        <w:t xml:space="preserve"> </w:t>
+      </w:r>
+      <w:r>
+        <w:t xml:space="preserve">from-scratch native Windows product line — its</w:t>
       </w:r>
       <w:r>
         <w:t xml:space="preserve"> </w:t>

</xml_diff>

<commit_message>
fix: keep beta playout continuous across program and filler boundaries
Signed-off-by: Scott Converse <1474146+scottconverse@users.noreply.github.com>
</commit_message>
<xml_diff>
--- a/docs/USER-MANUAL.docx
+++ b/docs/USER-MANUAL.docx
@@ -31,7 +31,7 @@
         <w:pStyle w:val="Date"/>
       </w:pPr>
       <w:r>
-        <w:t xml:space="preserve">2026-08-30</w:t>
+        <w:t xml:space="preserve">2026-09-08</w:t>
       </w:r>
     </w:p>
     <w:sdt>
@@ -465,6 +465,125 @@
       </w:r>
       <w:r>
         <w:t xml:space="preserve">private repository.</w:t>
+      </w:r>
+    </w:p>
+    <w:p>
+      <w:pPr>
+        <w:pStyle w:val="BodyText"/>
+      </w:pPr>
+      <w:r>
+        <w:t xml:space="preserve">In the beta.5 development build, schedule rollover uses an in-place reload</w:t>
+      </w:r>
+      <w:r>
+        <w:t xml:space="preserve"> </w:t>
+      </w:r>
+      <w:r>
+        <w:t xml:space="preserve">by default: the playout worker prepares the next plan while the current plan</w:t>
+      </w:r>
+      <w:r>
+        <w:t xml:space="preserve"> </w:t>
+      </w:r>
+      <w:r>
+        <w:t xml:space="preserve">airs. When scheduled media ends, the channel switches to its configured</w:t>
+      </w:r>
+      <w:r>
+        <w:t xml:space="preserve"> </w:t>
+      </w:r>
+      <w:r>
+        <w:t xml:space="preserve">bulletins or slate; that filler refreshes until another program is due.</w:t>
+      </w:r>
+      <w:r>
+        <w:t xml:space="preserve"> </w:t>
+      </w:r>
+      <w:r>
+        <w:t xml:space="preserve">Large bulletin rotations retain every approved, currently airable slide.</w:t>
+      </w:r>
+      <w:r>
+        <w:t xml:space="preserve"> </w:t>
+      </w:r>
+      <w:r>
+        <w:t xml:space="preserve">Operators do not need to enable an environment flag. For troubleshooting,</w:t>
+      </w:r>
+      <w:r>
+        <w:t xml:space="preserve"> </w:t>
+      </w:r>
+      <w:r>
+        <w:t xml:space="preserve">IT may set</w:t>
+      </w:r>
+      <w:r>
+        <w:t xml:space="preserve"> </w:t>
+      </w:r>
+      <w:r>
+        <w:rPr>
+          <w:rStyle w:val="VerbatimChar"/>
+        </w:rPr>
+        <w:t xml:space="preserve">CIVICCAST_EGRESS_SEAMLESS_RELOAD=0</w:t>
+      </w:r>
+      <w:r>
+        <w:t xml:space="preserve"> </w:t>
+      </w:r>
+      <w:r>
+        <w:t xml:space="preserve">(also</w:t>
+      </w:r>
+      <w:r>
+        <w:t xml:space="preserve"> </w:t>
+      </w:r>
+      <w:r>
+        <w:rPr>
+          <w:rStyle w:val="VerbatimChar"/>
+        </w:rPr>
+        <w:t xml:space="preserve">false</w:t>
+      </w:r>
+      <w:r>
+        <w:t xml:space="preserve">,</w:t>
+      </w:r>
+      <w:r>
+        <w:t xml:space="preserve"> </w:t>
+      </w:r>
+      <w:r>
+        <w:rPr>
+          <w:rStyle w:val="VerbatimChar"/>
+        </w:rPr>
+        <w:t xml:space="preserve">no</w:t>
+      </w:r>
+      <w:r>
+        <w:t xml:space="preserve">, or</w:t>
+      </w:r>
+      <w:r>
+        <w:t xml:space="preserve"> </w:t>
+      </w:r>
+      <w:r>
+        <w:rPr>
+          <w:rStyle w:val="VerbatimChar"/>
+        </w:rPr>
+        <w:t xml:space="preserve">off</w:t>
+      </w:r>
+      <w:r>
+        <w:t xml:space="preserve">)</w:t>
+      </w:r>
+      <w:r>
+        <w:t xml:space="preserve"> </w:t>
+      </w:r>
+      <w:r>
+        <w:t xml:space="preserve">in the service environment and restart the service during a maintenance</w:t>
+      </w:r>
+      <w:r>
+        <w:t xml:space="preserve"> </w:t>
+      </w:r>
+      <w:r>
+        <w:t xml:space="preserve">window. This opts into encoder restarts at plan rollover and may interrupt</w:t>
+      </w:r>
+      <w:r>
+        <w:t xml:space="preserve"> </w:t>
+      </w:r>
+      <w:r>
+        <w:t xml:space="preserve">output. Remove that override to restore the default. Installed-candidate</w:t>
+      </w:r>
+      <w:r>
+        <w:t xml:space="preserve"> </w:t>
+      </w:r>
+      <w:r>
+        <w:t xml:space="preserve">soak results are required before this development candidate is published.</w:t>
       </w:r>
     </w:p>
     <w:p>
@@ -7034,29 +7153,19 @@
         </w:numPr>
       </w:pPr>
       <w:r>
-        <w:t xml:space="preserve">Leave at least</w:t>
-      </w:r>
-      <w:r>
-        <w:t xml:space="preserve"> </w:t>
-      </w:r>
-      <w:r>
-        <w:rPr>
-          <w:b/>
-          <w:bCs/>
-        </w:rPr>
-        <w:t xml:space="preserve">5 GB free</w:t>
-      </w:r>
-      <w:r>
-        <w:t xml:space="preserve"> </w:t>
-      </w:r>
-      <w:r>
-        <w:t xml:space="preserve">for the base installation. Recordings, station</w:t>
-      </w:r>
-      <w:r>
-        <w:t xml:space="preserve"> </w:t>
-      </w:r>
-      <w:r>
-        <w:t xml:space="preserve">media, backups, and downloaded caption models require additional storage.</w:t>
+        <w:t xml:space="preserve">Budget disk space for the downloaded kit, its installed runtime and model</w:t>
+      </w:r>
+      <w:r>
+        <w:t xml:space="preserve"> </w:t>
+      </w:r>
+      <w:r>
+        <w:t xml:space="preserve">files, and separate capacity for recordings, station media and backups.</w:t>
+      </w:r>
+      <w:r>
+        <w:t xml:space="preserve"> </w:t>
+      </w:r>
+      <w:r>
+        <w:t xml:space="preserve">Five GB is not enough for a complete first installation.</w:t>
       </w:r>
     </w:p>
     <w:p>
@@ -7077,37 +7186,67 @@
         <w:t xml:space="preserve"> </w:t>
       </w:r>
       <w:r>
-        <w:t xml:space="preserve">The local AI models (Ollama summary and</w:t>
-      </w:r>
-      <w:r>
-        <w:t xml:space="preserve"> </w:t>
-      </w:r>
-      <w:r>
-        <w:t xml:space="preserve">translation models, roughly 15-20 GB combined) are large; CivicCast</w:t>
-      </w:r>
-      <w:r>
-        <w:t xml:space="preserve"> </w:t>
-      </w:r>
-      <w:r>
-        <w:t xml:space="preserve">ensures the same three-tag target set and downloads only the tags still</w:t>
-      </w:r>
-      <w:r>
-        <w:t xml:space="preserve"> </w:t>
-      </w:r>
-      <w:r>
-        <w:t xml:space="preserve">missing, automatically in the background after the base install finishes,</w:t>
-      </w:r>
-      <w:r>
-        <w:t xml:space="preserve"> </w:t>
-      </w:r>
-      <w:r>
-        <w:t xml:space="preserve">not before, and a slow or failed model download does not block the</w:t>
-      </w:r>
-      <w:r>
-        <w:t xml:space="preserve"> </w:t>
-      </w:r>
-      <w:r>
-        <w:t xml:space="preserve">operator console from opening.</w:t>
+        <w:t xml:space="preserve">A first install needs the signed</w:t>
+      </w:r>
+      <w:r>
+        <w:t xml:space="preserve"> </w:t>
+      </w:r>
+      <w:r>
+        <w:rPr>
+          <w:rStyle w:val="VerbatimChar"/>
+        </w:rPr>
+        <w:t xml:space="preserve">station</w:t>
+      </w:r>
+      <w:r>
+        <w:t xml:space="preserve"> </w:t>
+      </w:r>
+      <w:r>
+        <w:t xml:space="preserve">model</w:t>
+      </w:r>
+      <w:r>
+        <w:t xml:space="preserve"> </w:t>
+      </w:r>
+      <w:r>
+        <w:t xml:space="preserve">bundle (about 21 GB), delivered by USB or LAN beside</w:t>
+      </w:r>
+      <w:r>
+        <w:t xml:space="preserve"> </w:t>
+      </w:r>
+      <w:r>
+        <w:rPr>
+          <w:rStyle w:val="VerbatimChar"/>
+        </w:rPr>
+        <w:t xml:space="preserve">setup.exe</w:t>
+      </w:r>
+      <w:r>
+        <w:t xml:space="preserve"> </w:t>
+      </w:r>
+      <w:r>
+        <w:t xml:space="preserve">and the</w:t>
+      </w:r>
+      <w:r>
+        <w:t xml:space="preserve"> </w:t>
+      </w:r>
+      <w:r>
+        <w:t xml:space="preserve">runtime packs. Setup verifies and activates those model components,</w:t>
+      </w:r>
+      <w:r>
+        <w:t xml:space="preserve"> </w:t>
+      </w:r>
+      <w:r>
+        <w:t xml:space="preserve">including the required caption floor and summary/translation models.</w:t>
+      </w:r>
+      <w:r>
+        <w:t xml:space="preserve"> </w:t>
+      </w:r>
+      <w:r>
+        <w:t xml:space="preserve">Do not rely on background internet downloads to complete a missing</w:t>
+      </w:r>
+      <w:r>
+        <w:t xml:space="preserve"> </w:t>
+      </w:r>
+      <w:r>
+        <w:t xml:space="preserve">model bundle. Upgrades from beta.3 or later reuse matching cached models.</w:t>
       </w:r>
     </w:p>
     <w:p>
@@ -7360,13 +7499,13 @@
         <w:pStyle w:val="FirstParagraph"/>
       </w:pPr>
       <w:r>
-        <w:t xml:space="preserve">Use the complete new CivicCast kit and run its installer directly on the</w:t>
-      </w:r>
-      <w:r>
-        <w:t xml:space="preserve"> </w:t>
-      </w:r>
-      <w:r>
-        <w:t xml:space="preserve">station that already has CivicCast (Native) installed. You do</w:t>
+        <w:t xml:space="preserve">Run the new CivicCast installer directly on the station that already has</w:t>
+      </w:r>
+      <w:r>
+        <w:t xml:space="preserve"> </w:t>
+      </w:r>
+      <w:r>
+        <w:t xml:space="preserve">CivicCast (Native) installed. You do</w:t>
       </w:r>
       <w:r>
         <w:t xml:space="preserve"> </w:t>
@@ -7382,13 +7521,25 @@
         <w:t xml:space="preserve"> </w:t>
       </w:r>
       <w:r>
-        <w:t xml:space="preserve">need to</w:t>
-      </w:r>
-      <w:r>
-        <w:t xml:space="preserve"> </w:t>
-      </w:r>
-      <w:r>
-        <w:t xml:space="preserve">uninstall the current version first.</w:t>
+        <w:t xml:space="preserve">need to uninstall the current</w:t>
+      </w:r>
+      <w:r>
+        <w:t xml:space="preserve"> </w:t>
+      </w:r>
+      <w:r>
+        <w:t xml:space="preserve">version first. From beta.3 onward, download-only upgrades reuse the installed</w:t>
+      </w:r>
+      <w:r>
+        <w:t xml:space="preserve"> </w:t>
+      </w:r>
+      <w:r>
+        <w:t xml:space="preserve">models; a fresh station or the older beta.1 migration needs the complete kit</w:t>
+      </w:r>
+      <w:r>
+        <w:t xml:space="preserve"> </w:t>
+      </w:r>
+      <w:r>
+        <w:t xml:space="preserve">described in the Windows installation guide.</w:t>
       </w:r>
     </w:p>
     <w:p>
@@ -7436,7 +7587,7 @@
         </w:numPr>
       </w:pPr>
       <w:r>
-        <w:t xml:space="preserve">Keep the new</w:t>
+        <w:t xml:space="preserve">Keep the release-matched</w:t>
       </w:r>
       <w:r>
         <w:t xml:space="preserve"> </w:t>
@@ -7448,22 +7599,16 @@
         <w:t xml:space="preserve">setup.exe</w:t>
       </w:r>
       <w:r>
-        <w:t xml:space="preserve">, its</w:t>
-      </w:r>
-      <w:r>
-        <w:t xml:space="preserve"> </w:t>
-      </w:r>
-      <w:r>
-        <w:rPr>
-          <w:rStyle w:val="VerbatimChar"/>
-        </w:rPr>
-        <w:t xml:space="preserve">packs</w:t>
-      </w:r>
-      <w:r>
-        <w:t xml:space="preserve"> </w:t>
-      </w:r>
-      <w:r>
-        <w:t xml:space="preserve">folder, and its</w:t>
+        <w:t xml:space="preserve"> </w:t>
+      </w:r>
+      <w:r>
+        <w:t xml:space="preserve">and runtime packs together as</w:t>
+      </w:r>
+      <w:r>
+        <w:t xml:space="preserve"> </w:t>
+      </w:r>
+      <w:r>
+        <w:t xml:space="preserve">described in the Windows installation guide. Include the</w:t>
       </w:r>
       <w:r>
         <w:t xml:space="preserve"> </w:t>
@@ -7478,13 +7623,7 @@
         <w:t xml:space="preserve"> </w:t>
       </w:r>
       <w:r>
-        <w:t xml:space="preserve">folder</w:t>
-      </w:r>
-      <w:r>
-        <w:t xml:space="preserve"> </w:t>
-      </w:r>
-      <w:r>
-        <w:t xml:space="preserve">together, then run</w:t>
+        <w:t xml:space="preserve">folder when using the full USB/LAN kit. Run</w:t>
       </w:r>
       <w:r>
         <w:t xml:space="preserve"> </w:t>

</xml_diff>

<commit_message>
fix: align settled filler health with channel state
Signed-off-by: Scott Converse <1474146+scottconverse@users.noreply.github.com>
</commit_message>
<xml_diff>
--- a/docs/USER-MANUAL.docx
+++ b/docs/USER-MANUAL.docx
@@ -497,6 +497,18 @@
       </w:r>
       <w:r>
         <w:t xml:space="preserve">Large bulletin rotations retain every approved, currently airable slide.</w:t>
+      </w:r>
+      <w:r>
+        <w:t xml:space="preserve"> </w:t>
+      </w:r>
+      <w:r>
+        <w:t xml:space="preserve">After a handoff, channel status and health reporting agree on whether the</w:t>
+      </w:r>
+      <w:r>
+        <w:t xml:space="preserve"> </w:t>
+      </w:r>
+      <w:r>
+        <w:t xml:space="preserve">channel is airing a scheduled program or its configured filler.</w:t>
       </w:r>
       <w:r>
         <w:t xml:space="preserve"> </w:t>

</xml_diff>

<commit_message>
docs: make packaged beta manual publication independent
Signed-off-by: Scott Converse <1474146+scottconverse@users.noreply.github.com>
</commit_message>
<xml_diff>
--- a/docs/USER-MANUAL.docx
+++ b/docs/USER-MANUAL.docx
@@ -60,7 +60,7 @@
         </w:p>
       </w:sdtContent>
     </w:sdt>
-    <w:bookmarkStart w:id="106" w:name="civiccast-user-manual"/>
+    <w:bookmarkStart w:id="107" w:name="civiccast-user-manual"/>
     <w:p>
       <w:pPr>
         <w:pStyle w:val="Heading1"/>
@@ -321,123 +321,134 @@
         <w:t xml:space="preserve"> </w:t>
       </w:r>
       <w:r>
-        <w:t xml:space="preserve">production proof.</w:t>
-      </w:r>
-      <w:r>
-        <w:t xml:space="preserve"> </w:t>
-      </w:r>
-      <w:r>
-        <w:rPr>
-          <w:rStyle w:val="VerbatimChar"/>
-        </w:rPr>
-        <w:t xml:space="preserve">v1.0.0-beta.2</w:t>
-      </w:r>
-      <w:r>
-        <w:t xml:space="preserve"> </w:t>
-      </w:r>
-      <w:r>
-        <w:t xml:space="preserve">was never published – it exists only as an</w:t>
-      </w:r>
-      <w:r>
-        <w:t xml:space="preserve"> </w:t>
-      </w:r>
-      <w:r>
-        <w:t xml:space="preserve">internal Gate A upgrade-baseline kit.</w:t>
-      </w:r>
-      <w:r>
-        <w:t xml:space="preserve"> </w:t>
-      </w:r>
-      <w:r>
-        <w:rPr>
-          <w:rStyle w:val="VerbatimChar"/>
-        </w:rPr>
-        <w:t xml:space="preserve">v1.0.0-beta.4</w:t>
-      </w:r>
-      <w:r>
-        <w:t xml:space="preserve"> </w:t>
-      </w:r>
-      <w:r>
-        <w:t xml:space="preserve">is the current</w:t>
-      </w:r>
-      <w:r>
-        <w:t xml:space="preserve"> </w:t>
-      </w:r>
-      <w:r>
-        <w:t xml:space="preserve">published release described in this manual, a download-only upgrade for</w:t>
-      </w:r>
-      <w:r>
-        <w:t xml:space="preserve"> </w:t>
-      </w:r>
-      <w:r>
-        <w:t xml:space="preserve">stations already on</w:t>
-      </w:r>
-      <w:r>
-        <w:t xml:space="preserve"> </w:t>
-      </w:r>
-      <w:r>
-        <w:rPr>
-          <w:rStyle w:val="VerbatimChar"/>
-        </w:rPr>
-        <w:t xml:space="preserve">v1.0.0-beta.3</w:t>
-      </w:r>
-      <w:r>
-        <w:t xml:space="preserve"> </w:t>
-      </w:r>
-      <w:r>
-        <w:t xml:space="preserve">(CivicCast’s first downloadable</w:t>
-      </w:r>
-      <w:r>
-        <w:t xml:space="preserve"> </w:t>
-      </w:r>
-      <w:r>
-        <w:t xml:space="preserve">release, now superseded – see</w:t>
+        <w:t xml:space="preserve">production proof. This manual describes the</w:t>
+      </w:r>
+      <w:r>
+        <w:t xml:space="preserve"> </w:t>
+      </w:r>
+      <w:r>
+        <w:rPr>
+          <w:rStyle w:val="VerbatimChar"/>
+        </w:rPr>
+        <w:t xml:space="preserve">v1.0.0-beta.5</w:t>
+      </w:r>
+      <w:r>
+        <w:t xml:space="preserve"> </w:t>
+      </w:r>
+      <w:r>
+        <w:t xml:space="preserve">native-Windows</w:t>
+      </w:r>
+      <w:r>
+        <w:t xml:space="preserve"> </w:t>
+      </w:r>
+      <w:r>
+        <w:t xml:space="preserve">software. A bundled manual does not itself establish publication or installation acceptance.</w:t>
+      </w:r>
+      <w:r>
+        <w:t xml:space="preserve"> </w:t>
+      </w:r>
+      <w:r>
+        <w:t xml:space="preserve">Before installing, check the exact</w:t>
       </w:r>
       <w:r>
         <w:t xml:space="preserve"> </w:t>
       </w:r>
       <w:hyperlink r:id="rId9">
+        <w:r>
+          <w:rPr>
+            <w:rStyle w:val="Hyperlink"/>
+          </w:rPr>
+          <w:t xml:space="preserve">GitHub Release</w:t>
+        </w:r>
+      </w:hyperlink>
+      <w:r>
+        <w:t xml:space="preserve">,</w:t>
+      </w:r>
+      <w:r>
+        <w:t xml:space="preserve"> </w:t>
+      </w:r>
+      <w:r>
+        <w:t xml:space="preserve">its signed installer, checksums and candidate-specific verification record;</w:t>
+      </w:r>
+      <w:r>
+        <w:t xml:space="preserve"> </w:t>
+      </w:r>
+      <w:r>
+        <w:t xml:space="preserve">the current recommendation is recorded in</w:t>
+      </w:r>
+      <w:r>
+        <w:t xml:space="preserve"> </w:t>
+      </w:r>
+      <w:hyperlink r:id="rId10">
         <w:r>
           <w:rPr>
             <w:rStyle w:val="VerbatimChar"/>
           </w:rPr>
-          <w:t xml:space="preserve">docs/releases/release-truth.yaml</w:t>
+          <w:t xml:space="preserve">release-truth.yaml</w:t>
         </w:r>
       </w:hyperlink>
       <w:r>
-        <w:t xml:space="preserve">).</w:t>
-      </w:r>
-      <w:r>
-        <w:t xml:space="preserve"> </w:t>
-      </w:r>
-      <w:r>
-        <w:rPr>
-          <w:rStyle w:val="VerbatimChar"/>
-        </w:rPr>
-        <w:t xml:space="preserve">v1.0.0-beta.5</w:t>
-      </w:r>
-      <w:r>
-        <w:t xml:space="preserve"> </w:t>
-      </w:r>
-      <w:r>
-        <w:t xml:space="preserve">is the next candidate and the current native-Windows</w:t>
-      </w:r>
-      <w:r>
-        <w:t xml:space="preserve"> </w:t>
-      </w:r>
-      <w:r>
-        <w:t xml:space="preserve">development candidate (an owner-held unpublished candidate) described in</w:t>
-      </w:r>
-      <w:r>
-        <w:t xml:space="preserve"> </w:t>
-      </w:r>
-      <w:r>
-        <w:t xml:space="preserve">this manual; it does not change the beta.4 install story. It is a fresh,</w:t>
-      </w:r>
-      <w:r>
-        <w:t xml:space="preserve"> </w:t>
-      </w:r>
-      <w:r>
-        <w:t xml:space="preserve">from-scratch native Windows product line — its</w:t>
+        <w:t xml:space="preserve">.</w:t>
+      </w:r>
+      <w:r>
+        <w:t xml:space="preserve"> </w:t>
+      </w:r>
+      <w:r>
+        <w:t xml:space="preserve">That release record can change after this immutable installer/manual is built.</w:t>
+      </w:r>
+      <w:r>
+        <w:t xml:space="preserve"> </w:t>
+      </w:r>
+      <w:r>
+        <w:t xml:space="preserve">Downloadable upgrades preserve a beta.3-or-later station’s cached AI models;</w:t>
+      </w:r>
+      <w:r>
+        <w:t xml:space="preserve"> </w:t>
+      </w:r>
+      <w:r>
+        <w:t xml:space="preserve">first-time installations also require the approximately 21 GB</w:t>
+      </w:r>
+      <w:r>
+        <w:t xml:space="preserve"> </w:t>
+      </w:r>
+      <w:r>
+        <w:rPr>
+          <w:rStyle w:val="VerbatimChar"/>
+        </w:rPr>
+        <w:t xml:space="preserve">station</w:t>
+      </w:r>
+      <w:r>
+        <w:t xml:space="preserve"> </w:t>
+      </w:r>
+      <w:r>
+        <w:t xml:space="preserve">model</w:t>
+      </w:r>
+      <w:r>
+        <w:t xml:space="preserve"> </w:t>
+      </w:r>
+      <w:r>
+        <w:t xml:space="preserve">bundle delivered by USB or LAN. See the Windows installation section below.</w:t>
+      </w:r>
+      <w:r>
+        <w:t xml:space="preserve"> </w:t>
+      </w:r>
+      <w:r>
+        <w:rPr>
+          <w:rStyle w:val="VerbatimChar"/>
+        </w:rPr>
+        <w:t xml:space="preserve">v1.0.0-beta.2</w:t>
+      </w:r>
+      <w:r>
+        <w:t xml:space="preserve"> </w:t>
+      </w:r>
+      <w:r>
+        <w:t xml:space="preserve">was never published; it is an internal upgrade-baseline kit.</w:t>
+      </w:r>
+      <w:r>
+        <w:t xml:space="preserve"> </w:t>
+      </w:r>
+      <w:r>
+        <w:t xml:space="preserve">This is a fresh, from-scratch native Windows product line – its</w:t>
       </w:r>
       <w:r>
         <w:t xml:space="preserve"> </w:t>
@@ -472,7 +483,7 @@
         <w:pStyle w:val="BodyText"/>
       </w:pPr>
       <w:r>
-        <w:t xml:space="preserve">In the beta.5 development build, schedule rollover uses an in-place reload</w:t>
+        <w:t xml:space="preserve">In beta.5, schedule rollover uses an in-place reload</w:t>
       </w:r>
       <w:r>
         <w:t xml:space="preserve"> </w:t>
@@ -589,13 +600,19 @@
         <w:t xml:space="preserve"> </w:t>
       </w:r>
       <w:r>
-        <w:t xml:space="preserve">output. Remove that override to restore the default. Installed-candidate</w:t>
-      </w:r>
-      <w:r>
-        <w:t xml:space="preserve"> </w:t>
-      </w:r>
-      <w:r>
-        <w:t xml:space="preserve">soak results are required before this development candidate is published.</w:t>
+        <w:t xml:space="preserve">output. Remove that override to restore the default. Each published beta</w:t>
+      </w:r>
+      <w:r>
+        <w:t xml:space="preserve"> </w:t>
+      </w:r>
+      <w:r>
+        <w:t xml:space="preserve">requires its own signed-candidate installation and soak evidence; a version</w:t>
+      </w:r>
+      <w:r>
+        <w:t xml:space="preserve"> </w:t>
+      </w:r>
+      <w:r>
+        <w:t xml:space="preserve">number or this manual is not a substitute for that evidence.</w:t>
       </w:r>
     </w:p>
     <w:p>
@@ -607,18 +624,18 @@
           <wp:inline>
             <wp:extent cx="5334000" cy="3000375"/>
             <wp:effectExtent b="0" l="0" r="0" t="0"/>
-            <wp:docPr descr="CivicCast system architecture" title="" id="11" name="Picture"/>
+            <wp:docPr descr="CivicCast system architecture" title="" id="12" name="Picture"/>
             <a:graphic>
               <a:graphicData uri="http://schemas.openxmlformats.org/drawingml/2006/picture">
                 <pic:pic>
                   <pic:nvPicPr>
-                    <pic:cNvPr descr="assets/architecture/civiccast-system-architecture.png" id="12" name="Picture"/>
+                    <pic:cNvPr descr="assets/architecture/civiccast-system-architecture.png" id="13" name="Picture"/>
                     <pic:cNvPicPr>
                       <a:picLocks noChangeArrowheads="1" noChangeAspect="1"/>
                     </pic:cNvPicPr>
                   </pic:nvPicPr>
                   <pic:blipFill>
-                    <a:blip r:embed="rId10"/>
+                    <a:blip r:embed="rId11"/>
                     <a:stretch>
                       <a:fillRect/>
                     </a:stretch>
@@ -653,7 +670,7 @@
         <w:t xml:space="preserve">CivicCast system architecture</w:t>
       </w:r>
     </w:p>
-    <w:bookmarkStart w:id="19" w:name="who-reads-what"/>
+    <w:bookmarkStart w:id="20" w:name="who-reads-what"/>
     <w:p>
       <w:pPr>
         <w:pStyle w:val="Heading2"/>
@@ -746,7 +763,7 @@
             <w:pPr>
               <w:pStyle w:val="Compact"/>
             </w:pPr>
-            <w:hyperlink r:id="rId13">
+            <w:hyperlink r:id="rId14">
               <w:r>
                 <w:rPr>
                   <w:rStyle w:val="Hyperlink"/>
@@ -760,7 +777,7 @@
             <w:r>
               <w:t xml:space="preserve"> </w:t>
             </w:r>
-            <w:hyperlink r:id="rId14">
+            <w:hyperlink r:id="rId15">
               <w:r>
                 <w:rPr>
                   <w:rStyle w:val="Hyperlink"/>
@@ -805,7 +822,7 @@
             <w:pPr>
               <w:pStyle w:val="Compact"/>
             </w:pPr>
-            <w:hyperlink r:id="rId15">
+            <w:hyperlink r:id="rId16">
               <w:r>
                 <w:rPr>
                   <w:rStyle w:val="Hyperlink"/>
@@ -819,7 +836,7 @@
             <w:r>
               <w:t xml:space="preserve"> </w:t>
             </w:r>
-            <w:hyperlink r:id="rId16">
+            <w:hyperlink r:id="rId17">
               <w:r>
                 <w:rPr>
                   <w:rStyle w:val="Hyperlink"/>
@@ -864,7 +881,7 @@
             <w:pPr>
               <w:pStyle w:val="Compact"/>
             </w:pPr>
-            <w:hyperlink r:id="rId17">
+            <w:hyperlink r:id="rId18">
               <w:r>
                 <w:rPr>
                   <w:rStyle w:val="Hyperlink"/>
@@ -878,7 +895,7 @@
             <w:r>
               <w:t xml:space="preserve"> </w:t>
             </w:r>
-            <w:hyperlink r:id="rId18">
+            <w:hyperlink r:id="rId19">
               <w:r>
                 <w:rPr>
                   <w:rStyle w:val="Hyperlink"/>
@@ -897,8 +914,8 @@
         </w:pict>
       </w:r>
     </w:p>
-    <w:bookmarkEnd w:id="19"/>
-    <w:bookmarkStart w:id="50" w:name="section-a-end-user-guide"/>
+    <w:bookmarkEnd w:id="20"/>
+    <w:bookmarkStart w:id="51" w:name="section-a-end-user-guide"/>
     <w:p>
       <w:pPr>
         <w:pStyle w:val="Heading2"/>
@@ -955,7 +972,7 @@
         <w:t xml:space="preserve">.</w:t>
       </w:r>
     </w:p>
-    <w:bookmarkStart w:id="20" w:name="what-is-civiccast"/>
+    <w:bookmarkStart w:id="21" w:name="what-is-civiccast"/>
     <w:p>
       <w:pPr>
         <w:pStyle w:val="Heading3"/>
@@ -1220,8 +1237,8 @@
         <w:t xml:space="preserve">accounts.</w:t>
       </w:r>
     </w:p>
-    <w:bookmarkEnd w:id="20"/>
-    <w:bookmarkStart w:id="21" w:name="advanced-not-this-beta"/>
+    <w:bookmarkEnd w:id="21"/>
+    <w:bookmarkStart w:id="22" w:name="advanced-not-this-beta"/>
     <w:p>
       <w:pPr>
         <w:pStyle w:val="Heading3"/>
@@ -1582,8 +1599,8 @@
         <w:t xml:space="preserve">honest answer is: the code exists, the field proof does not yet.</w:t>
       </w:r>
     </w:p>
-    <w:bookmarkEnd w:id="21"/>
-    <w:bookmarkStart w:id="22" w:name="your-first-beta-workflow"/>
+    <w:bookmarkEnd w:id="22"/>
+    <w:bookmarkStart w:id="23" w:name="your-first-beta-workflow"/>
     <w:p>
       <w:pPr>
         <w:pStyle w:val="Heading3"/>
@@ -1998,8 +2015,8 @@
         <w:t xml:space="preserve">and play the approved recording. Unapproved media must remain private.</w:t>
       </w:r>
     </w:p>
-    <w:bookmarkEnd w:id="22"/>
-    <w:bookmarkStart w:id="23" w:name="destructive-actions-confirm"/>
+    <w:bookmarkEnd w:id="23"/>
+    <w:bookmarkStart w:id="24" w:name="destructive-actions-confirm"/>
     <w:p>
       <w:pPr>
         <w:pStyle w:val="Heading3"/>
@@ -2454,8 +2471,8 @@
         <w:t xml:space="preserve">confirmation fatigue, not safety.</w:t>
       </w:r>
     </w:p>
-    <w:bookmarkEnd w:id="23"/>
-    <w:bookmarkStart w:id="24" w:name="where-recordings-live"/>
+    <w:bookmarkEnd w:id="24"/>
+    <w:bookmarkStart w:id="25" w:name="where-recordings-live"/>
     <w:p>
       <w:pPr>
         <w:pStyle w:val="Heading3"/>
@@ -2849,8 +2866,8 @@
         <w:t xml:space="preserve">station and would silently mean nothing was actually being backed up.</w:t>
       </w:r>
     </w:p>
-    <w:bookmarkEnd w:id="24"/>
-    <w:bookmarkStart w:id="25" w:name="managing-sign-in"/>
+    <w:bookmarkEnd w:id="25"/>
+    <w:bookmarkStart w:id="26" w:name="managing-sign-in"/>
     <w:p>
       <w:pPr>
         <w:pStyle w:val="Heading3"/>
@@ -3077,8 +3094,8 @@
         <w:t xml:space="preserve">locked out.</w:t>
       </w:r>
     </w:p>
-    <w:bookmarkEnd w:id="25"/>
-    <w:bookmarkStart w:id="26" w:name="publish-surfaces"/>
+    <w:bookmarkEnd w:id="26"/>
+    <w:bookmarkStart w:id="27" w:name="publish-surfaces"/>
     <w:p>
       <w:pPr>
         <w:pStyle w:val="Heading3"/>
@@ -3381,8 +3398,8 @@
         <w:t xml:space="preserve">to know whether a recording is public.</w:t>
       </w:r>
     </w:p>
-    <w:bookmarkEnd w:id="26"/>
-    <w:bookmarkStart w:id="27" w:name="cdn-cost-estimate"/>
+    <w:bookmarkEnd w:id="27"/>
+    <w:bookmarkStart w:id="28" w:name="cdn-cost-estimate"/>
     <w:p>
       <w:pPr>
         <w:pStyle w:val="Heading3"/>
@@ -3516,8 +3533,8 @@
         <w:t xml:space="preserve">CDN.</w:t>
       </w:r>
     </w:p>
-    <w:bookmarkEnd w:id="27"/>
-    <w:bookmarkStart w:id="28" w:name="live-broadcast-limits"/>
+    <w:bookmarkEnd w:id="28"/>
+    <w:bookmarkStart w:id="29" w:name="live-broadcast-limits"/>
     <w:p>
       <w:pPr>
         <w:pStyle w:val="Heading3"/>
@@ -3732,8 +3749,8 @@
         <w:t xml:space="preserve">the recording and finalization status before publishing.</w:t>
       </w:r>
     </w:p>
-    <w:bookmarkEnd w:id="28"/>
-    <w:bookmarkStart w:id="29" w:name="live-captions-switch"/>
+    <w:bookmarkEnd w:id="29"/>
+    <w:bookmarkStart w:id="30" w:name="live-captions-switch"/>
     <w:p>
       <w:pPr>
         <w:pStyle w:val="Heading3"/>
@@ -4005,8 +4022,8 @@
         <w:t xml:space="preserve">off, or ask about a lower-quality caption model or a supported graphics card.</w:t>
       </w:r>
     </w:p>
-    <w:bookmarkEnd w:id="29"/>
-    <w:bookmarkStart w:id="30" w:name="operator-graphics-control"/>
+    <w:bookmarkEnd w:id="30"/>
+    <w:bookmarkStart w:id="31" w:name="operator-graphics-control"/>
     <w:p>
       <w:pPr>
         <w:pStyle w:val="Heading3"/>
@@ -4125,8 +4142,8 @@
         <w:t xml:space="preserve">panel; only the lower-third text layer is.</w:t>
       </w:r>
     </w:p>
-    <w:bookmarkEnd w:id="30"/>
-    <w:bookmarkStart w:id="31" w:name="common-operator-questions"/>
+    <w:bookmarkEnd w:id="31"/>
+    <w:bookmarkStart w:id="32" w:name="common-operator-questions"/>
     <w:p>
       <w:pPr>
         <w:pStyle w:val="Heading3"/>
@@ -5084,8 +5101,8 @@
         <w:t xml:space="preserve">publish it.</w:t>
       </w:r>
     </w:p>
-    <w:bookmarkEnd w:id="31"/>
-    <w:bookmarkStart w:id="41" w:name="provider-setup-plain-language"/>
+    <w:bookmarkEnd w:id="32"/>
+    <w:bookmarkStart w:id="42" w:name="provider-setup-plain-language"/>
     <w:p>
       <w:pPr>
         <w:pStyle w:val="Heading3"/>
@@ -5276,7 +5293,7 @@
         <w:t xml:space="preserve">steps, and a link back to the matching part of this manual.</w:t>
       </w:r>
     </w:p>
-    <w:bookmarkStart w:id="32" w:name="provider-cloudflare-r2"/>
+    <w:bookmarkStart w:id="33" w:name="provider-cloudflare-r2"/>
     <w:p>
       <w:pPr>
         <w:pStyle w:val="Heading4"/>
@@ -5406,8 +5423,8 @@
         <w:t xml:space="preserve">fallback below the concierge box.</w:t>
       </w:r>
     </w:p>
-    <w:bookmarkEnd w:id="32"/>
-    <w:bookmarkStart w:id="33" w:name="provider-internet-archive"/>
+    <w:bookmarkEnd w:id="33"/>
+    <w:bookmarkStart w:id="34" w:name="provider-internet-archive"/>
     <w:p>
       <w:pPr>
         <w:pStyle w:val="Heading4"/>
@@ -5500,8 +5517,8 @@
         <w:t xml:space="preserve">your own keys in yourself.</w:t>
       </w:r>
     </w:p>
-    <w:bookmarkEnd w:id="33"/>
-    <w:bookmarkStart w:id="35" w:name="provider-youtube"/>
+    <w:bookmarkEnd w:id="34"/>
+    <w:bookmarkStart w:id="36" w:name="provider-youtube"/>
     <w:p>
       <w:pPr>
         <w:pStyle w:val="Heading4"/>
@@ -5548,7 +5565,7 @@
       <w:r>
         <w:t xml:space="preserve"> </w:t>
       </w:r>
-      <w:hyperlink r:id="rId34">
+      <w:hyperlink r:id="rId35">
         <w:r>
           <w:rPr>
             <w:rStyle w:val="Hyperlink"/>
@@ -5578,8 +5595,8 @@
         <w:t xml:space="preserve">upload proof before using YouTube for residents.</w:t>
       </w:r>
     </w:p>
-    <w:bookmarkEnd w:id="35"/>
-    <w:bookmarkStart w:id="36" w:name="provider-subscriber-notifications"/>
+    <w:bookmarkEnd w:id="36"/>
+    <w:bookmarkStart w:id="37" w:name="provider-subscriber-notifications"/>
     <w:p>
       <w:pPr>
         <w:pStyle w:val="Heading4"/>
@@ -5636,8 +5653,8 @@
         <w:t xml:space="preserve">or you can paste one from your notification provider.</w:t>
       </w:r>
     </w:p>
-    <w:bookmarkEnd w:id="36"/>
-    <w:bookmarkStart w:id="37" w:name="provider-local-archive-folder"/>
+    <w:bookmarkEnd w:id="37"/>
+    <w:bookmarkStart w:id="38" w:name="provider-local-archive-folder"/>
     <w:p>
       <w:pPr>
         <w:pStyle w:val="Heading4"/>
@@ -5686,8 +5703,8 @@
         <w:t xml:space="preserve">itself in that folder before marking this ready.</w:t>
       </w:r>
     </w:p>
-    <w:bookmarkEnd w:id="37"/>
-    <w:bookmarkStart w:id="38" w:name="provider-alternative-cdns"/>
+    <w:bookmarkEnd w:id="38"/>
+    <w:bookmarkStart w:id="39" w:name="provider-alternative-cdns"/>
     <w:p>
       <w:pPr>
         <w:pStyle w:val="Heading4"/>
@@ -5853,8 +5870,8 @@
         <w:t xml:space="preserve">card’s Setup guide lists the exact fields.</w:t>
       </w:r>
     </w:p>
-    <w:bookmarkEnd w:id="38"/>
-    <w:bookmarkStart w:id="39" w:name="provider-federation"/>
+    <w:bookmarkEnd w:id="39"/>
+    <w:bookmarkStart w:id="40" w:name="provider-federation"/>
     <w:p>
       <w:pPr>
         <w:pStyle w:val="Heading4"/>
@@ -5957,8 +5974,8 @@
         <w:t xml:space="preserve">queue.</w:t>
       </w:r>
     </w:p>
-    <w:bookmarkEnd w:id="39"/>
-    <w:bookmarkStart w:id="40" w:name="provider-podcast-feed"/>
+    <w:bookmarkEnd w:id="40"/>
+    <w:bookmarkStart w:id="41" w:name="provider-podcast-feed"/>
     <w:p>
       <w:pPr>
         <w:pStyle w:val="Heading4"/>
@@ -6047,9 +6064,9 @@
         <w:t xml:space="preserve">appears here for review.</w:t>
       </w:r>
     </w:p>
-    <w:bookmarkEnd w:id="40"/>
     <w:bookmarkEnd w:id="41"/>
-    <w:bookmarkStart w:id="42" w:name="glossary"/>
+    <w:bookmarkEnd w:id="42"/>
+    <w:bookmarkStart w:id="43" w:name="glossary"/>
     <w:p>
       <w:pPr>
         <w:pStyle w:val="Heading3"/>
@@ -6392,8 +6409,8 @@
         </w:tc>
       </w:tr>
     </w:tbl>
-    <w:bookmarkEnd w:id="42"/>
-    <w:bookmarkStart w:id="43" w:name="when-to-ask-for-help"/>
+    <w:bookmarkEnd w:id="43"/>
+    <w:bookmarkStart w:id="44" w:name="when-to-ask-for-help"/>
     <w:p>
       <w:pPr>
         <w:pStyle w:val="Heading3"/>
@@ -6544,8 +6561,8 @@
         <w:t xml:space="preserve">CivicCast asks for a recovery code and the kit cannot be found.</w:t>
       </w:r>
     </w:p>
-    <w:bookmarkEnd w:id="43"/>
-    <w:bookmarkStart w:id="45" w:name="report-without-github"/>
+    <w:bookmarkEnd w:id="44"/>
+    <w:bookmarkStart w:id="46" w:name="report-without-github"/>
     <w:p>
       <w:pPr>
         <w:pStyle w:val="Heading3"/>
@@ -6712,7 +6729,7 @@
       <w:r>
         <w:t xml:space="preserve"> </w:t>
       </w:r>
-      <w:hyperlink r:id="rId44">
+      <w:hyperlink r:id="rId45">
         <w:r>
           <w:rPr>
             <w:rStyle w:val="Hyperlink"/>
@@ -6747,8 +6764,8 @@
         <w:t xml:space="preserve">For routine workflow questions, use the role-specific guides:</w:t>
       </w:r>
     </w:p>
-    <w:bookmarkEnd w:id="45"/>
-    <w:bookmarkStart w:id="46" w:name="admin-quick-guide"/>
+    <w:bookmarkEnd w:id="46"/>
+    <w:bookmarkStart w:id="47" w:name="admin-quick-guide"/>
     <w:p>
       <w:pPr>
         <w:pStyle w:val="Heading3"/>
@@ -6765,7 +6782,7 @@
           <w:numId w:val="1011"/>
         </w:numPr>
       </w:pPr>
-      <w:hyperlink r:id="rId15">
+      <w:hyperlink r:id="rId16">
         <w:r>
           <w:rPr>
             <w:rStyle w:val="Hyperlink"/>
@@ -6780,8 +6797,8 @@
         <w:t xml:space="preserve">— first install, recovery, backups.</w:t>
       </w:r>
     </w:p>
-    <w:bookmarkEnd w:id="46"/>
-    <w:bookmarkStart w:id="47" w:name="meeting-operator-quick-guide"/>
+    <w:bookmarkEnd w:id="47"/>
+    <w:bookmarkStart w:id="48" w:name="meeting-operator-quick-guide"/>
     <w:p>
       <w:pPr>
         <w:pStyle w:val="Heading3"/>
@@ -6798,7 +6815,7 @@
           <w:numId w:val="1012"/>
         </w:numPr>
       </w:pPr>
-      <w:hyperlink r:id="rId13">
+      <w:hyperlink r:id="rId14">
         <w:r>
           <w:rPr>
             <w:rStyle w:val="Hyperlink"/>
@@ -6813,8 +6830,8 @@
         <w:t xml:space="preserve">— night-of-meeting.</w:t>
       </w:r>
     </w:p>
-    <w:bookmarkEnd w:id="47"/>
-    <w:bookmarkStart w:id="49" w:name="records-clerk-quick-guide"/>
+    <w:bookmarkEnd w:id="48"/>
+    <w:bookmarkStart w:id="50" w:name="records-clerk-quick-guide"/>
     <w:p>
       <w:pPr>
         <w:pStyle w:val="Heading3"/>
@@ -6831,7 +6848,7 @@
           <w:numId w:val="1013"/>
         </w:numPr>
       </w:pPr>
-      <w:hyperlink r:id="rId14">
+      <w:hyperlink r:id="rId15">
         <w:r>
           <w:rPr>
             <w:rStyle w:val="Hyperlink"/>
@@ -6854,7 +6871,7 @@
           <w:numId w:val="1013"/>
         </w:numPr>
       </w:pPr>
-      <w:hyperlink r:id="rId48">
+      <w:hyperlink r:id="rId49">
         <w:r>
           <w:rPr>
             <w:rStyle w:val="Hyperlink"/>
@@ -6936,9 +6953,9 @@
         </w:pict>
       </w:r>
     </w:p>
-    <w:bookmarkEnd w:id="49"/>
     <w:bookmarkEnd w:id="50"/>
-    <w:bookmarkStart w:id="76" w:name="section-b-technical-reference"/>
+    <w:bookmarkEnd w:id="51"/>
+    <w:bookmarkStart w:id="77" w:name="section-b-technical-reference"/>
     <w:p>
       <w:pPr>
         <w:pStyle w:val="Heading2"/>
@@ -6983,7 +7000,7 @@
       <w:r>
         <w:t xml:space="preserve"> </w:t>
       </w:r>
-      <w:hyperlink r:id="rId16">
+      <w:hyperlink r:id="rId17">
         <w:r>
           <w:rPr>
             <w:rStyle w:val="Hyperlink"/>
@@ -7003,7 +7020,7 @@
       <w:r>
         <w:t xml:space="preserve"> </w:t>
       </w:r>
-      <w:hyperlink r:id="rId51">
+      <w:hyperlink r:id="rId52">
         <w:r>
           <w:rPr>
             <w:rStyle w:val="Hyperlink"/>
@@ -7015,7 +7032,7 @@
         <w:t xml:space="preserve">.</w:t>
       </w:r>
     </w:p>
-    <w:bookmarkStart w:id="52" w:name="install-and-first-boot"/>
+    <w:bookmarkStart w:id="53" w:name="install-and-first-boot"/>
     <w:p>
       <w:pPr>
         <w:pStyle w:val="Heading3"/>
@@ -7145,7 +7162,7 @@
       <w:r>
         <w:t xml:space="preserve"> </w:t>
       </w:r>
-      <w:hyperlink r:id="rId51">
+      <w:hyperlink r:id="rId52">
         <w:r>
           <w:rPr>
             <w:rStyle w:val="Hyperlink"/>
@@ -7496,8 +7513,8 @@
         <w:t xml:space="preserve">rehearsal before the first public meeting.</w:t>
       </w:r>
     </w:p>
-    <w:bookmarkEnd w:id="52"/>
-    <w:bookmarkStart w:id="53" w:name="upgrade-path"/>
+    <w:bookmarkEnd w:id="53"/>
+    <w:bookmarkStart w:id="54" w:name="upgrade-path"/>
     <w:p>
       <w:pPr>
         <w:pStyle w:val="Heading3"/>
@@ -7843,8 +7860,8 @@
         <w:t xml:space="preserve">account’s saved installer preferences; it is not a data-purge control.</w:t>
       </w:r>
     </w:p>
-    <w:bookmarkEnd w:id="53"/>
-    <w:bookmarkStart w:id="54" w:name="roles-and-permissions"/>
+    <w:bookmarkEnd w:id="54"/>
+    <w:bookmarkStart w:id="55" w:name="roles-and-permissions"/>
     <w:p>
       <w:pPr>
         <w:pStyle w:val="Heading3"/>
@@ -8226,8 +8243,8 @@
         <w:t xml:space="preserve">subcommands.</w:t>
       </w:r>
     </w:p>
-    <w:bookmarkEnd w:id="54"/>
-    <w:bookmarkStart w:id="69" w:name="environment-variables"/>
+    <w:bookmarkEnd w:id="55"/>
+    <w:bookmarkStart w:id="70" w:name="environment-variables"/>
     <w:p>
       <w:pPr>
         <w:pStyle w:val="Heading3"/>
@@ -8283,7 +8300,7 @@
         <w:t xml:space="preserve">station needs.</w:t>
       </w:r>
     </w:p>
-    <w:bookmarkStart w:id="55" w:name="identity-storage-and-first-run"/>
+    <w:bookmarkStart w:id="56" w:name="identity-storage-and-first-run"/>
     <w:p>
       <w:pPr>
         <w:pStyle w:val="Heading4"/>
@@ -8676,8 +8693,8 @@
         <w:t xml:space="preserve">Tests only.</w:t>
       </w:r>
     </w:p>
-    <w:bookmarkEnd w:id="55"/>
-    <w:bookmarkStart w:id="56" w:name="staff-identity-and-tokens"/>
+    <w:bookmarkEnd w:id="56"/>
+    <w:bookmarkStart w:id="57" w:name="staff-identity-and-tokens"/>
     <w:p>
       <w:pPr>
         <w:pStyle w:val="Heading4"/>
@@ -8920,8 +8937,8 @@
         <w:t xml:space="preserve">enable token (prevents accidental live calls).</w:t>
       </w:r>
     </w:p>
-    <w:bookmarkEnd w:id="56"/>
-    <w:bookmarkStart w:id="57" w:name="X99996ae5c79277d16d09b8280d01fb5b3843f55"/>
+    <w:bookmarkEnd w:id="57"/>
+    <w:bookmarkStart w:id="58" w:name="X99996ae5c79277d16d09b8280d01fb5b3843f55"/>
     <w:p>
       <w:pPr>
         <w:pStyle w:val="Heading4"/>
@@ -9559,8 +9576,8 @@
         <w:t xml:space="preserve">— Worker-supervision timeouts.</w:t>
       </w:r>
     </w:p>
-    <w:bookmarkEnd w:id="57"/>
-    <w:bookmarkStart w:id="58" w:name="captions-eas-alerting"/>
+    <w:bookmarkEnd w:id="58"/>
+    <w:bookmarkStart w:id="59" w:name="captions-eas-alerting"/>
     <w:p>
       <w:pPr>
         <w:pStyle w:val="Heading4"/>
@@ -10450,8 +10467,8 @@
         <w:t xml:space="preserve">— Event-bus on/off.</w:t>
       </w:r>
     </w:p>
-    <w:bookmarkEnd w:id="58"/>
-    <w:bookmarkStart w:id="59" w:name="cdn-public-base-url-trusted-proxies"/>
+    <w:bookmarkEnd w:id="59"/>
+    <w:bookmarkStart w:id="60" w:name="cdn-public-base-url-trusted-proxies"/>
     <w:p>
       <w:pPr>
         <w:pStyle w:val="Heading4"/>
@@ -10893,8 +10910,8 @@
         <w:t xml:space="preserve">— Cloudflare R2 origin credentials.</w:t>
       </w:r>
     </w:p>
-    <w:bookmarkEnd w:id="59"/>
-    <w:bookmarkStart w:id="60" w:name="tsa-records-rfc-3161"/>
+    <w:bookmarkEnd w:id="60"/>
+    <w:bookmarkStart w:id="61" w:name="tsa-records-rfc-3161"/>
     <w:p>
       <w:pPr>
         <w:pStyle w:val="Heading4"/>
@@ -11004,8 +11021,8 @@
         <w:t xml:space="preserve">— veraPDF artifact directory for the signed-record export proof.</w:t>
       </w:r>
     </w:p>
-    <w:bookmarkEnd w:id="60"/>
-    <w:bookmarkStart w:id="61" w:name="providers-publish-archive-syndicate"/>
+    <w:bookmarkEnd w:id="61"/>
+    <w:bookmarkStart w:id="62" w:name="providers-publish-archive-syndicate"/>
     <w:p>
       <w:pPr>
         <w:pStyle w:val="Heading4"/>
@@ -11874,8 +11891,8 @@
         <w:t xml:space="preserve">— Local NAS archive target.</w:t>
       </w:r>
     </w:p>
-    <w:bookmarkEnd w:id="61"/>
-    <w:bookmarkStart w:id="62" w:name="subscribe-email-webhook"/>
+    <w:bookmarkEnd w:id="62"/>
+    <w:bookmarkStart w:id="63" w:name="subscribe-email-webhook"/>
     <w:p>
       <w:pPr>
         <w:pStyle w:val="Heading4"/>
@@ -12252,8 +12269,8 @@
         <w:t xml:space="preserve">secrets. It is for tests only and must never be enabled at a station.</w:t>
       </w:r>
     </w:p>
-    <w:bookmarkEnd w:id="62"/>
-    <w:bookmarkStart w:id="63" w:name="analytics"/>
+    <w:bookmarkEnd w:id="63"/>
+    <w:bookmarkStart w:id="64" w:name="analytics"/>
     <w:p>
       <w:pPr>
         <w:pStyle w:val="Heading4"/>
@@ -12423,8 +12440,8 @@
         <w:t xml:space="preserve">— Analytics-specific trusted-proxy CIDRs.</w:t>
       </w:r>
     </w:p>
-    <w:bookmarkEnd w:id="63"/>
-    <w:bookmarkStart w:id="64" w:name="activitypub-federation"/>
+    <w:bookmarkEnd w:id="64"/>
+    <w:bookmarkStart w:id="65" w:name="activitypub-federation"/>
     <w:p>
       <w:pPr>
         <w:pStyle w:val="Heading4"/>
@@ -12883,8 +12900,8 @@
         <w:t xml:space="preserve">— Retry and rate-limit controls.</w:t>
       </w:r>
     </w:p>
-    <w:bookmarkEnd w:id="64"/>
-    <w:bookmarkStart w:id="65" w:name="headend-handoff-ndi-sdi-tsduck"/>
+    <w:bookmarkEnd w:id="65"/>
+    <w:bookmarkStart w:id="66" w:name="headend-handoff-ndi-sdi-tsduck"/>
     <w:p>
       <w:pPr>
         <w:pStyle w:val="Heading4"/>
@@ -13229,8 +13246,8 @@
         <w:t xml:space="preserve">— Cable file-package output.</w:t>
       </w:r>
     </w:p>
-    <w:bookmarkEnd w:id="65"/>
-    <w:bookmarkStart w:id="66" w:name="Xf44d74e96fbc1f4fb4dabd34408b2be6935e023"/>
+    <w:bookmarkEnd w:id="66"/>
+    <w:bookmarkStart w:id="67" w:name="Xf44d74e96fbc1f4fb4dabd34408b2be6935e023"/>
     <w:p>
       <w:pPr>
         <w:pStyle w:val="Heading4"/>
@@ -13785,8 +13802,8 @@
         <w:t xml:space="preserve">Resident portal URL handles.</w:t>
       </w:r>
     </w:p>
-    <w:bookmarkEnd w:id="66"/>
-    <w:bookmarkStart w:id="67" w:name="ai-model-dispatch"/>
+    <w:bookmarkEnd w:id="67"/>
+    <w:bookmarkStart w:id="68" w:name="ai-model-dispatch"/>
     <w:p>
       <w:pPr>
         <w:pStyle w:val="Heading4"/>
@@ -13853,8 +13870,8 @@
         <w:t xml:space="preserve">.)</w:t>
       </w:r>
     </w:p>
-    <w:bookmarkEnd w:id="67"/>
-    <w:bookmarkStart w:id="68" w:name="diagnostics-and-overrides"/>
+    <w:bookmarkEnd w:id="68"/>
+    <w:bookmarkStart w:id="69" w:name="diagnostics-and-overrides"/>
     <w:p>
       <w:pPr>
         <w:pStyle w:val="Heading4"/>
@@ -14208,9 +14225,9 @@
         <w:t xml:space="preserve">— Run Postgres-only test suites against an external server.</w:t>
       </w:r>
     </w:p>
-    <w:bookmarkEnd w:id="68"/>
     <w:bookmarkEnd w:id="69"/>
-    <w:bookmarkStart w:id="70" w:name="credential-store"/>
+    <w:bookmarkEnd w:id="70"/>
+    <w:bookmarkStart w:id="71" w:name="credential-store"/>
     <w:p>
       <w:pPr>
         <w:pStyle w:val="Heading3"/>
@@ -14562,8 +14579,8 @@
         <w:t xml:space="preserve">line and a credential reference label.</w:t>
       </w:r>
     </w:p>
-    <w:bookmarkEnd w:id="70"/>
-    <w:bookmarkStart w:id="71" w:name="cli-reference"/>
+    <w:bookmarkEnd w:id="71"/>
+    <w:bookmarkStart w:id="72" w:name="cli-reference"/>
     <w:p>
       <w:pPr>
         <w:pStyle w:val="Heading3"/>
@@ -15087,8 +15104,8 @@
         <w:t xml:space="preserve">and Stripe secrets must never appear on a command line in production.</w:t>
       </w:r>
     </w:p>
-    <w:bookmarkEnd w:id="71"/>
-    <w:bookmarkStart w:id="72" w:name="troubleshooting-matrix"/>
+    <w:bookmarkEnd w:id="72"/>
+    <w:bookmarkStart w:id="73" w:name="troubleshooting-matrix"/>
     <w:p>
       <w:pPr>
         <w:pStyle w:val="Heading3"/>
@@ -15742,7 +15759,7 @@
       <w:r>
         <w:t xml:space="preserve"> </w:t>
       </w:r>
-      <w:hyperlink r:id="rId16">
+      <w:hyperlink r:id="rId17">
         <w:r>
           <w:rPr>
             <w:rStyle w:val="Hyperlink"/>
@@ -15870,8 +15887,8 @@
         <w:t xml:space="preserve">honestly without blocking the rest of the install.</w:t>
       </w:r>
     </w:p>
-    <w:bookmarkEnd w:id="72"/>
-    <w:bookmarkStart w:id="75" w:name="cross-references"/>
+    <w:bookmarkEnd w:id="73"/>
+    <w:bookmarkStart w:id="76" w:name="cross-references"/>
     <w:p>
       <w:pPr>
         <w:pStyle w:val="Heading3"/>
@@ -15888,7 +15905,7 @@
           <w:numId w:val="1030"/>
         </w:numPr>
       </w:pPr>
-      <w:hyperlink r:id="rId15">
+      <w:hyperlink r:id="rId16">
         <w:r>
           <w:rPr>
             <w:rStyle w:val="Hyperlink"/>
@@ -15911,7 +15928,7 @@
           <w:numId w:val="1030"/>
         </w:numPr>
       </w:pPr>
-      <w:hyperlink r:id="rId13">
+      <w:hyperlink r:id="rId14">
         <w:r>
           <w:rPr>
             <w:rStyle w:val="Hyperlink"/>
@@ -15934,7 +15951,7 @@
           <w:numId w:val="1030"/>
         </w:numPr>
       </w:pPr>
-      <w:hyperlink r:id="rId14">
+      <w:hyperlink r:id="rId15">
         <w:r>
           <w:rPr>
             <w:rStyle w:val="Hyperlink"/>
@@ -15957,7 +15974,7 @@
           <w:numId w:val="1030"/>
         </w:numPr>
       </w:pPr>
-      <w:hyperlink r:id="rId16">
+      <w:hyperlink r:id="rId17">
         <w:r>
           <w:rPr>
             <w:rStyle w:val="Hyperlink"/>
@@ -15986,7 +16003,7 @@
           <w:numId w:val="1030"/>
         </w:numPr>
       </w:pPr>
-      <w:hyperlink r:id="rId48">
+      <w:hyperlink r:id="rId49">
         <w:r>
           <w:rPr>
             <w:rStyle w:val="Hyperlink"/>
@@ -16009,7 +16026,7 @@
           <w:numId w:val="1030"/>
         </w:numPr>
       </w:pPr>
-      <w:hyperlink r:id="rId73">
+      <w:hyperlink r:id="rId74">
         <w:r>
           <w:rPr>
             <w:rStyle w:val="Hyperlink"/>
@@ -16029,7 +16046,7 @@
           <w:numId w:val="1030"/>
         </w:numPr>
       </w:pPr>
-      <w:hyperlink r:id="rId74">
+      <w:hyperlink r:id="rId75">
         <w:r>
           <w:rPr>
             <w:rStyle w:val="Hyperlink"/>
@@ -16048,9 +16065,9 @@
         </w:pict>
       </w:r>
     </w:p>
-    <w:bookmarkEnd w:id="75"/>
     <w:bookmarkEnd w:id="76"/>
-    <w:bookmarkStart w:id="104" w:name="section-c-architecture-reference"/>
+    <w:bookmarkEnd w:id="77"/>
+    <w:bookmarkStart w:id="105" w:name="section-c-architecture-reference"/>
     <w:p>
       <w:pPr>
         <w:pStyle w:val="Heading2"/>
@@ -16095,7 +16112,7 @@
       <w:r>
         <w:t xml:space="preserve"> </w:t>
       </w:r>
-      <w:hyperlink r:id="rId77">
+      <w:hyperlink r:id="rId78">
         <w:r>
           <w:rPr>
             <w:rStyle w:val="Hyperlink"/>
@@ -16115,7 +16132,7 @@
       <w:r>
         <w:t xml:space="preserve"> </w:t>
       </w:r>
-      <w:hyperlink r:id="rId78">
+      <w:hyperlink r:id="rId79">
         <w:r>
           <w:rPr>
             <w:rStyle w:val="Hyperlink"/>
@@ -16135,7 +16152,7 @@
       <w:r>
         <w:t xml:space="preserve"> </w:t>
       </w:r>
-      <w:hyperlink r:id="rId18">
+      <w:hyperlink r:id="rId19">
         <w:r>
           <w:rPr>
             <w:rStyle w:val="Hyperlink"/>
@@ -16156,18 +16173,18 @@
           <wp:inline>
             <wp:extent cx="5334000" cy="2667000"/>
             <wp:effectExtent b="0" l="0" r="0" t="0"/>
-            <wp:docPr descr="CivicCast channel-egress architecture" title="" id="80" name="Picture"/>
+            <wp:docPr descr="CivicCast channel-egress architecture" title="" id="81" name="Picture"/>
             <a:graphic>
               <a:graphicData uri="http://schemas.openxmlformats.org/drawingml/2006/picture">
                 <pic:pic>
                   <pic:nvPicPr>
-                    <pic:cNvPr descr="assets/architecture/civiccast-egress-proof-architecture.png" id="81" name="Picture"/>
+                    <pic:cNvPr descr="assets/architecture/civiccast-egress-proof-architecture.png" id="82" name="Picture"/>
                     <pic:cNvPicPr>
                       <a:picLocks noChangeArrowheads="1" noChangeAspect="1"/>
                     </pic:cNvPicPr>
                   </pic:nvPicPr>
                   <pic:blipFill>
-                    <a:blip r:embed="rId79"/>
+                    <a:blip r:embed="rId80"/>
                     <a:stretch>
                       <a:fillRect/>
                     </a:stretch>
@@ -16202,7 +16219,7 @@
         <w:t xml:space="preserve">CivicCast channel-egress architecture</w:t>
       </w:r>
     </w:p>
-    <w:bookmarkStart w:id="82" w:name="subsystems-and-module-layout"/>
+    <w:bookmarkStart w:id="83" w:name="subsystems-and-module-layout"/>
     <w:p>
       <w:pPr>
         <w:pStyle w:val="Heading3"/>
@@ -16519,8 +16536,8 @@
         <w:t xml:space="preserve">└── common/trusted_proxy.py  CDN-aware client-IP resolver</w:t>
       </w:r>
     </w:p>
-    <w:bookmarkEnd w:id="82"/>
-    <w:bookmarkStart w:id="84" w:name="the-five-role-model"/>
+    <w:bookmarkEnd w:id="83"/>
+    <w:bookmarkStart w:id="85" w:name="the-five-role-model"/>
     <w:p>
       <w:pPr>
         <w:pStyle w:val="Heading3"/>
@@ -16539,7 +16556,7 @@
       <w:r>
         <w:t xml:space="preserve"> </w:t>
       </w:r>
-      <w:hyperlink r:id="rId83">
+      <w:hyperlink r:id="rId84">
         <w:r>
           <w:rPr>
             <w:rStyle w:val="VerbatimChar"/>
@@ -16729,8 +16746,8 @@
         <w:t xml:space="preserve">window.</w:t>
       </w:r>
     </w:p>
-    <w:bookmarkEnd w:id="84"/>
-    <w:bookmarkStart w:id="85" w:name="the-alembic-migration-chain"/>
+    <w:bookmarkEnd w:id="85"/>
+    <w:bookmarkStart w:id="86" w:name="the-alembic-migration-chain"/>
     <w:p>
       <w:pPr>
         <w:pStyle w:val="Heading3"/>
@@ -16779,7 +16796,7 @@
       <w:r>
         <w:t xml:space="preserve"> </w:t>
       </w:r>
-      <w:hyperlink r:id="rId18">
+      <w:hyperlink r:id="rId19">
         <w:r>
           <w:rPr>
             <w:rStyle w:val="Hyperlink"/>
@@ -17085,7 +17102,7 @@
       <w:r>
         <w:t xml:space="preserve"> </w:t>
       </w:r>
-      <w:hyperlink r:id="rId78">
+      <w:hyperlink r:id="rId79">
         <w:r>
           <w:rPr>
             <w:rStyle w:val="Hyperlink"/>
@@ -17100,8 +17117,8 @@
         <w:t xml:space="preserve">tracks the capability evidence associated with the chain.</w:t>
       </w:r>
     </w:p>
-    <w:bookmarkEnd w:id="85"/>
-    <w:bookmarkStart w:id="87" w:name="the-s15-gstreamer-playout-engine"/>
+    <w:bookmarkEnd w:id="86"/>
+    <w:bookmarkStart w:id="88" w:name="the-s15-gstreamer-playout-engine"/>
     <w:p>
       <w:pPr>
         <w:pStyle w:val="Heading3"/>
@@ -17117,7 +17134,7 @@
       <w:r>
         <w:t xml:space="preserve">The S15 playout engine (</w:t>
       </w:r>
-      <w:hyperlink r:id="rId86">
+      <w:hyperlink r:id="rId87">
         <w:r>
           <w:rPr>
             <w:rStyle w:val="VerbatimChar"/>
@@ -17323,8 +17340,8 @@
         <w:t xml:space="preserve">into the legacy ffmpeg-relay model for backwards compatibility.</w:t>
       </w:r>
     </w:p>
-    <w:bookmarkEnd w:id="87"/>
-    <w:bookmarkStart w:id="89" w:name="the-three-protocol-seams"/>
+    <w:bookmarkEnd w:id="88"/>
+    <w:bookmarkStart w:id="90" w:name="the-three-protocol-seams"/>
     <w:p>
       <w:pPr>
         <w:pStyle w:val="Heading3"/>
@@ -17370,7 +17387,7 @@
       <w:r>
         <w:t xml:space="preserve"> </w:t>
       </w:r>
-      <w:hyperlink r:id="rId88">
+      <w:hyperlink r:id="rId89">
         <w:r>
           <w:rPr>
             <w:rStyle w:val="VerbatimChar"/>
@@ -17766,8 +17783,8 @@
         <w:t xml:space="preserve">testable.</w:t>
       </w:r>
     </w:p>
-    <w:bookmarkEnd w:id="89"/>
-    <w:bookmarkStart w:id="90" w:name="the-publish-pipeline"/>
+    <w:bookmarkEnd w:id="90"/>
+    <w:bookmarkStart w:id="91" w:name="the-publish-pipeline"/>
     <w:p>
       <w:pPr>
         <w:pStyle w:val="Heading3"/>
@@ -18060,8 +18077,8 @@
         <w:t xml:space="preserve">emits XMLTV for downstream guides.</w:t>
       </w:r>
     </w:p>
-    <w:bookmarkEnd w:id="90"/>
-    <w:bookmarkStart w:id="92" w:name="the-cdn-aware-trusted-proxy-resolver"/>
+    <w:bookmarkEnd w:id="91"/>
+    <w:bookmarkStart w:id="93" w:name="the-cdn-aware-trusted-proxy-resolver"/>
     <w:p>
       <w:pPr>
         <w:pStyle w:val="Heading3"/>
@@ -18080,7 +18097,7 @@
       <w:r>
         <w:t xml:space="preserve"> </w:t>
       </w:r>
-      <w:hyperlink r:id="rId91">
+      <w:hyperlink r:id="rId92">
         <w:r>
           <w:rPr>
             <w:rStyle w:val="VerbatimChar"/>
@@ -18333,8 +18350,8 @@
         <w:t xml:space="preserve">runtime.</w:t>
       </w:r>
     </w:p>
-    <w:bookmarkEnd w:id="92"/>
-    <w:bookmarkStart w:id="93" w:name="comparative-capability-status"/>
+    <w:bookmarkEnd w:id="93"/>
+    <w:bookmarkStart w:id="94" w:name="comparative-capability-status"/>
     <w:p>
       <w:pPr>
         <w:pStyle w:val="Heading3"/>
@@ -18353,7 +18370,7 @@
       <w:r>
         <w:t xml:space="preserve"> </w:t>
       </w:r>
-      <w:hyperlink r:id="rId78">
+      <w:hyperlink r:id="rId79">
         <w:r>
           <w:rPr>
             <w:rStyle w:val="Hyperlink"/>
@@ -19193,8 +19210,8 @@
         <w:t xml:space="preserve">software, not a certified EAS device.</w:t>
       </w:r>
     </w:p>
-    <w:bookmarkEnd w:id="93"/>
-    <w:bookmarkStart w:id="103" w:name="open-items-and-roadmap-pointers"/>
+    <w:bookmarkEnd w:id="94"/>
+    <w:bookmarkStart w:id="104" w:name="open-items-and-roadmap-pointers"/>
     <w:p>
       <w:pPr>
         <w:pStyle w:val="Heading3"/>
@@ -19472,7 +19489,7 @@
           <w:numId w:val="1035"/>
         </w:numPr>
       </w:pPr>
-      <w:hyperlink r:id="rId94">
+      <w:hyperlink r:id="rId95">
         <w:r>
           <w:rPr>
             <w:rStyle w:val="Hyperlink"/>
@@ -19489,7 +19506,7 @@
           <w:numId w:val="1035"/>
         </w:numPr>
       </w:pPr>
-      <w:hyperlink r:id="rId95">
+      <w:hyperlink r:id="rId96">
         <w:r>
           <w:rPr>
             <w:rStyle w:val="Hyperlink"/>
@@ -19506,7 +19523,7 @@
           <w:numId w:val="1035"/>
         </w:numPr>
       </w:pPr>
-      <w:hyperlink r:id="rId96">
+      <w:hyperlink r:id="rId97">
         <w:r>
           <w:rPr>
             <w:rStyle w:val="Hyperlink"/>
@@ -19523,7 +19540,7 @@
           <w:numId w:val="1035"/>
         </w:numPr>
       </w:pPr>
-      <w:hyperlink r:id="rId97">
+      <w:hyperlink r:id="rId98">
         <w:r>
           <w:rPr>
             <w:rStyle w:val="Hyperlink"/>
@@ -19540,7 +19557,7 @@
           <w:numId w:val="1035"/>
         </w:numPr>
       </w:pPr>
-      <w:hyperlink r:id="rId98">
+      <w:hyperlink r:id="rId99">
         <w:r>
           <w:rPr>
             <w:rStyle w:val="Hyperlink"/>
@@ -19557,7 +19574,7 @@
           <w:numId w:val="1035"/>
         </w:numPr>
       </w:pPr>
-      <w:hyperlink r:id="rId99">
+      <w:hyperlink r:id="rId100">
         <w:r>
           <w:rPr>
             <w:rStyle w:val="Hyperlink"/>
@@ -19574,7 +19591,7 @@
           <w:numId w:val="1035"/>
         </w:numPr>
       </w:pPr>
-      <w:hyperlink r:id="rId100">
+      <w:hyperlink r:id="rId101">
         <w:r>
           <w:rPr>
             <w:rStyle w:val="Hyperlink"/>
@@ -19591,7 +19608,7 @@
           <w:numId w:val="1035"/>
         </w:numPr>
       </w:pPr>
-      <w:hyperlink r:id="rId101">
+      <w:hyperlink r:id="rId102">
         <w:r>
           <w:rPr>
             <w:rStyle w:val="Hyperlink"/>
@@ -19608,7 +19625,7 @@
           <w:numId w:val="1035"/>
         </w:numPr>
       </w:pPr>
-      <w:hyperlink r:id="rId102">
+      <w:hyperlink r:id="rId103">
         <w:r>
           <w:rPr>
             <w:rStyle w:val="Hyperlink"/>
@@ -19617,9 +19634,9 @@
         </w:r>
       </w:hyperlink>
     </w:p>
-    <w:bookmarkEnd w:id="103"/>
     <w:bookmarkEnd w:id="104"/>
-    <w:bookmarkStart w:id="105" w:name="language-standard"/>
+    <w:bookmarkEnd w:id="105"/>
+    <w:bookmarkStart w:id="106" w:name="language-standard"/>
     <w:p>
       <w:pPr>
         <w:pStyle w:val="Heading2"/>
@@ -19638,7 +19655,7 @@
       <w:r>
         <w:t xml:space="preserve"> </w:t>
       </w:r>
-      <w:hyperlink r:id="rId48">
+      <w:hyperlink r:id="rId49">
         <w:r>
           <w:rPr>
             <w:rStyle w:val="Hyperlink"/>
@@ -19846,8 +19863,8 @@
         <w:t xml:space="preserve">difference is clear to staff and to residents.</w:t>
       </w:r>
     </w:p>
-    <w:bookmarkEnd w:id="105"/>
     <w:bookmarkEnd w:id="106"/>
+    <w:bookmarkEnd w:id="107"/>
     <w:sectPr>
       <w:footnotePr>
         <w:numRestart w:val="eachSect"/>

</xml_diff>

<commit_message>
docs: regenerate packaged manuals for the native reload guidance
Signed-off-by: Scott Converse <1474146+scottconverse@users.noreply.github.com>
</commit_message>
<xml_diff>
--- a/docs/USER-MANUAL.docx
+++ b/docs/USER-MANUAL.docx
@@ -4140,6 +4140,72 @@
       </w:r>
       <w:r>
         <w:t xml:space="preserve">panel; only the lower-third text layer is.</w:t>
+      </w:r>
+    </w:p>
+    <w:p>
+      <w:pPr>
+        <w:pStyle w:val="BodyText"/>
+      </w:pPr>
+      <w:r>
+        <w:rPr>
+          <w:b/>
+          <w:bCs/>
+        </w:rPr>
+        <w:t xml:space="preserve">What happens during a program change?</w:t>
+      </w:r>
+      <w:r>
+        <w:t xml:space="preserve"> </w:t>
+      </w:r>
+      <w:r>
+        <w:t xml:space="preserve">CivicCast prepares the next program</w:t>
+      </w:r>
+      <w:r>
+        <w:t xml:space="preserve"> </w:t>
+      </w:r>
+      <w:r>
+        <w:t xml:space="preserve">while the current feed continues. An accepted reload request means preparation</w:t>
+      </w:r>
+      <w:r>
+        <w:t xml:space="preserve"> </w:t>
+      </w:r>
+      <w:r>
+        <w:t xml:space="preserve">has started, not that the new program is already on air. If another request</w:t>
+      </w:r>
+      <w:r>
+        <w:t xml:space="preserve"> </w:t>
+      </w:r>
+      <w:r>
+        <w:t xml:space="preserve">arrives while the previous change is finishing, CivicCast declines that</w:t>
+      </w:r>
+      <w:r>
+        <w:t xml:space="preserve"> </w:t>
+      </w:r>
+      <w:r>
+        <w:t xml:space="preserve">in-place request and the supervisor uses its existing channel-restart recovery</w:t>
+      </w:r>
+      <w:r>
+        <w:t xml:space="preserve"> </w:t>
+      </w:r>
+      <w:r>
+        <w:t xml:space="preserve">to load the current plan. A restart can briefly interrupt the feed. Check the</w:t>
+      </w:r>
+      <w:r>
+        <w:t xml:space="preserve"> </w:t>
+      </w:r>
+      <w:r>
+        <w:t xml:space="preserve">channel status and player to confirm the new program is running; do not treat</w:t>
+      </w:r>
+      <w:r>
+        <w:t xml:space="preserve"> </w:t>
+      </w:r>
+      <w:r>
+        <w:t xml:space="preserve">the initial request acknowledgement as confirmation of the picture on air.</w:t>
+      </w:r>
+      <w:r>
+        <w:t xml:space="preserve"> </w:t>
+      </w:r>
+      <w:r>
+        <w:t xml:space="preserve">The existing timeout and recovery safeguards remain active.</w:t>
       </w:r>
     </w:p>
     <w:bookmarkEnd w:id="31"/>

</xml_diff>

<commit_message>
docs: regenerate beta.7 user manual
Signed-off-by: Scott Converse <1474146+scottconverse@users.noreply.github.com>
</commit_message>
<xml_diff>
--- a/docs/USER-MANUAL.docx
+++ b/docs/USER-MANUAL.docx
@@ -15,7 +15,7 @@
         <w:pStyle w:val="Subtitle"/>
       </w:pPr>
       <w:r>
-        <w:t xml:space="preserve">For station operators, clerks, and IT staff - v1.0.0-beta.6 (native Windows line)</w:t>
+        <w:t xml:space="preserve">For station operators, clerks, and IT staff - v1.0.0-beta.7 (native Windows line)</w:t>
       </w:r>
     </w:p>
     <w:p>
@@ -330,7 +330,7 @@
         <w:rPr>
           <w:rStyle w:val="VerbatimChar"/>
         </w:rPr>
-        <w:t xml:space="preserve">v1.0.0-beta.6</w:t>
+        <w:t xml:space="preserve">v1.0.0-beta.7</w:t>
       </w:r>
       <w:r>
         <w:t xml:space="preserve"> </w:t>

</xml_diff>